<commit_message>
Melhoria no layout dos documentos pdf
</commit_message>
<xml_diff>
--- a/backend/scripts/sgq/rcc-pdf/templates/cliente.docx
+++ b/backend/scripts/sgq/rcc-pdf/templates/cliente.docx
@@ -53,16 +53,16 @@
               <w:rPr>
                 <w:rFonts w:ascii="Arial" w:hAnsi="Arial" w:cs="Arial"/>
                 <w:b/>
-                <w:sz w:val="16"/>
-                <w:szCs w:val="16"/>
-              </w:rPr>
-            </w:pPr>
-            <w:r>
-              <w:rPr>
-                <w:rFonts w:ascii="Arial" w:hAnsi="Arial" w:cs="Arial"/>
-                <w:b/>
-                <w:sz w:val="16"/>
-                <w:szCs w:val="16"/>
+                <w:sz w:val="26"/>
+                <w:szCs w:val="26"/>
+              </w:rPr>
+            </w:pPr>
+            <w:r>
+              <w:rPr>
+                <w:rFonts w:ascii="Arial" w:hAnsi="Arial" w:cs="Arial"/>
+                <w:b/>
+                <w:sz w:val="26"/>
+                <w:szCs w:val="26"/>
               </w:rPr>
               <w:t>REGISTRO DE RECLAMAÇÃO DE CLIENTE</w:t>
             </w:r>
@@ -70,8 +70,8 @@
               <w:rPr>
                 <w:rFonts w:ascii="Arial" w:hAnsi="Arial" w:cs="Arial"/>
                 <w:b/>
-                <w:sz w:val="16"/>
-                <w:szCs w:val="16"/>
+                <w:sz w:val="26"/>
+                <w:szCs w:val="26"/>
               </w:rPr>
               <w:t xml:space="preserve"> (RCC)</w:t>
             </w:r>
@@ -92,16 +92,16 @@
               <w:rPr>
                 <w:rFonts w:ascii="Arial" w:hAnsi="Arial" w:cs="Arial"/>
                 <w:b/>
-                <w:sz w:val="16"/>
-                <w:szCs w:val="16"/>
-              </w:rPr>
-            </w:pPr>
-            <w:r>
-              <w:rPr>
-                <w:rFonts w:ascii="Arial" w:hAnsi="Arial" w:cs="Arial"/>
-                <w:b/>
-                <w:sz w:val="16"/>
-                <w:szCs w:val="16"/>
+                <w:sz w:val="18"/>
+                <w:szCs w:val="18"/>
+              </w:rPr>
+            </w:pPr>
+            <w:r>
+              <w:rPr>
+                <w:rFonts w:ascii="Arial" w:hAnsi="Arial" w:cs="Arial"/>
+                <w:b/>
+                <w:sz w:val="18"/>
+                <w:szCs w:val="18"/>
               </w:rPr>
               <w:t>Nº Reclamação:</w:t>
             </w:r>
@@ -118,8 +118,8 @@
               <w:rPr>
                 <w:rFonts w:ascii="Arial" w:hAnsi="Arial" w:cs="Arial"/>
                 <w:b/>
-                <w:sz w:val="16"/>
-                <w:szCs w:val="16"/>
+                <w:sz w:val="18"/>
+                <w:szCs w:val="18"/>
               </w:rPr>
             </w:pPr>
           </w:p>
@@ -135,16 +135,16 @@
               <w:rPr>
                 <w:rFonts w:ascii="Arial" w:hAnsi="Arial" w:cs="Arial"/>
                 <w:b/>
-                <w:sz w:val="16"/>
-                <w:szCs w:val="16"/>
-              </w:rPr>
-            </w:pPr>
-            <w:r>
-              <w:rPr>
-                <w:rFonts w:ascii="Arial" w:hAnsi="Arial" w:cs="Arial"/>
-                <w:b/>
-                <w:sz w:val="16"/>
-                <w:szCs w:val="16"/>
+                <w:sz w:val="18"/>
+                <w:szCs w:val="18"/>
+              </w:rPr>
+            </w:pPr>
+            <w:r>
+              <w:rPr>
+                <w:rFonts w:ascii="Arial" w:hAnsi="Arial" w:cs="Arial"/>
+                <w:b/>
+                <w:sz w:val="18"/>
+                <w:szCs w:val="18"/>
               </w:rPr>
               <w:t>Data do registro:</w:t>
             </w:r>
@@ -161,8 +161,8 @@
               <w:rPr>
                 <w:rFonts w:ascii="Arial" w:hAnsi="Arial" w:cs="Arial"/>
                 <w:b/>
-                <w:sz w:val="16"/>
-                <w:szCs w:val="16"/>
+                <w:sz w:val="18"/>
+                <w:szCs w:val="18"/>
               </w:rPr>
             </w:pPr>
           </w:p>
@@ -178,16 +178,16 @@
               <w:rPr>
                 <w:rFonts w:ascii="Arial" w:hAnsi="Arial" w:cs="Arial"/>
                 <w:b/>
-                <w:sz w:val="16"/>
-                <w:szCs w:val="16"/>
-              </w:rPr>
-            </w:pPr>
-            <w:r>
-              <w:rPr>
-                <w:rFonts w:ascii="Arial" w:hAnsi="Arial" w:cs="Arial"/>
-                <w:b/>
-                <w:sz w:val="16"/>
-                <w:szCs w:val="16"/>
+                <w:sz w:val="18"/>
+                <w:szCs w:val="18"/>
+              </w:rPr>
+            </w:pPr>
+            <w:r>
+              <w:rPr>
+                <w:rFonts w:ascii="Arial" w:hAnsi="Arial" w:cs="Arial"/>
+                <w:b/>
+                <w:sz w:val="18"/>
+                <w:szCs w:val="18"/>
               </w:rPr>
               <w:t>Data de fechamento:</w:t>
             </w:r>
@@ -206,8 +206,8 @@
               <w:rPr>
                 <w:rFonts w:ascii="Arial" w:hAnsi="Arial" w:cs="Arial"/>
                 <w:bCs/>
-                <w:sz w:val="16"/>
-                <w:szCs w:val="16"/>
+                <w:sz w:val="18"/>
+                <w:szCs w:val="18"/>
               </w:rPr>
             </w:pPr>
           </w:p>
@@ -224,16 +224,16 @@
               <w:rPr>
                 <w:rFonts w:ascii="Arial" w:hAnsi="Arial" w:cs="Arial"/>
                 <w:b/>
-                <w:sz w:val="16"/>
-                <w:szCs w:val="16"/>
-              </w:rPr>
-            </w:pPr>
-            <w:r>
-              <w:rPr>
-                <w:rFonts w:ascii="Arial" w:hAnsi="Arial" w:cs="Arial"/>
-                <w:bCs/>
-                <w:sz w:val="16"/>
-                <w:szCs w:val="16"/>
+                <w:sz w:val="18"/>
+                <w:szCs w:val="18"/>
+              </w:rPr>
+            </w:pPr>
+            <w:r>
+              <w:rPr>
+                <w:rFonts w:ascii="Arial" w:hAnsi="Arial" w:cs="Arial"/>
+                <w:bCs/>
+                <w:sz w:val="18"/>
+                <w:szCs w:val="18"/>
               </w:rPr>
               <w:t xml:space="preserve"> </w:t>
             </w:r>
@@ -241,8 +241,8 @@
               <w:rPr>
                 <w:rFonts w:ascii="Arial" w:hAnsi="Arial" w:cs="Arial"/>
                 <w:b/>
-                <w:sz w:val="16"/>
-                <w:szCs w:val="16"/>
+                <w:sz w:val="18"/>
+                <w:szCs w:val="18"/>
               </w:rPr>
               <w:t>Status atual:</w:t>
             </w:r>
@@ -259,8 +259,8 @@
               <w:rPr>
                 <w:rFonts w:ascii="Arial" w:hAnsi="Arial" w:cs="Arial"/>
                 <w:b/>
-                <w:sz w:val="16"/>
-                <w:szCs w:val="16"/>
+                <w:sz w:val="18"/>
+                <w:szCs w:val="18"/>
               </w:rPr>
             </w:pPr>
           </w:p>
@@ -284,17 +284,17 @@
               <w:rPr>
                 <w:rFonts w:ascii="Arial" w:hAnsi="Arial" w:cs="Arial"/>
                 <w:bCs/>
-                <w:sz w:val="16"/>
-                <w:szCs w:val="16"/>
-              </w:rPr>
-            </w:pPr>
-            <w:r>
-              <w:rPr>
-                <w:rFonts w:ascii="Arial" w:hAnsi="Arial" w:cs="Arial"/>
-                <w:b/>
-                <w:bCs/>
-                <w:sz w:val="16"/>
-                <w:szCs w:val="16"/>
+                <w:sz w:val="18"/>
+                <w:szCs w:val="18"/>
+              </w:rPr>
+            </w:pPr>
+            <w:r>
+              <w:rPr>
+                <w:rFonts w:ascii="Arial" w:hAnsi="Arial" w:cs="Arial"/>
+                <w:b/>
+                <w:bCs/>
+                <w:sz w:val="18"/>
+                <w:szCs w:val="18"/>
               </w:rPr>
               <w:t>IDENTIFICAÇÃO DO CLIENTE</w:t>
             </w:r>
@@ -315,16 +315,16 @@
               <w:rPr>
                 <w:rFonts w:ascii="Arial" w:hAnsi="Arial" w:cs="Arial"/>
                 <w:b/>
-                <w:sz w:val="16"/>
-                <w:szCs w:val="16"/>
-              </w:rPr>
-            </w:pPr>
-            <w:r>
-              <w:rPr>
-                <w:rFonts w:ascii="Arial" w:hAnsi="Arial" w:cs="Arial"/>
-                <w:b/>
-                <w:sz w:val="16"/>
-                <w:szCs w:val="16"/>
+                <w:sz w:val="18"/>
+                <w:szCs w:val="18"/>
+              </w:rPr>
+            </w:pPr>
+            <w:r>
+              <w:rPr>
+                <w:rFonts w:ascii="Arial" w:hAnsi="Arial" w:cs="Arial"/>
+                <w:b/>
+                <w:sz w:val="18"/>
+                <w:szCs w:val="18"/>
               </w:rPr>
               <w:t>Nome cliente consumidor:</w:t>
             </w:r>
@@ -342,16 +342,16 @@
               <w:rPr>
                 <w:rFonts w:ascii="Arial" w:hAnsi="Arial" w:cs="Arial"/>
                 <w:bCs/>
-                <w:sz w:val="16"/>
-                <w:szCs w:val="16"/>
-              </w:rPr>
-            </w:pPr>
-            <w:r>
-              <w:rPr>
-                <w:rFonts w:ascii="Arial" w:hAnsi="Arial" w:cs="Arial"/>
-                <w:b/>
-                <w:sz w:val="16"/>
-                <w:szCs w:val="16"/>
+                <w:sz w:val="18"/>
+                <w:szCs w:val="18"/>
+              </w:rPr>
+            </w:pPr>
+            <w:r>
+              <w:rPr>
+                <w:rFonts w:ascii="Arial" w:hAnsi="Arial" w:cs="Arial"/>
+                <w:b/>
+                <w:sz w:val="18"/>
+                <w:szCs w:val="18"/>
               </w:rPr>
               <w:t xml:space="preserve"> </w:t>
             </w:r>
@@ -376,16 +376,16 @@
               <w:rPr>
                 <w:rFonts w:ascii="Arial" w:hAnsi="Arial" w:cs="Arial"/>
                 <w:b/>
-                <w:sz w:val="16"/>
-                <w:szCs w:val="16"/>
-              </w:rPr>
-            </w:pPr>
-            <w:r>
-              <w:rPr>
-                <w:rFonts w:ascii="Arial" w:hAnsi="Arial" w:cs="Arial"/>
-                <w:b/>
-                <w:sz w:val="16"/>
-                <w:szCs w:val="16"/>
+                <w:sz w:val="18"/>
+                <w:szCs w:val="18"/>
+              </w:rPr>
+            </w:pPr>
+            <w:r>
+              <w:rPr>
+                <w:rFonts w:ascii="Arial" w:hAnsi="Arial" w:cs="Arial"/>
+                <w:b/>
+                <w:sz w:val="18"/>
+                <w:szCs w:val="18"/>
               </w:rPr>
               <w:t>Nome cliente revendedor</w:t>
             </w:r>
@@ -403,8 +403,8 @@
               <w:rPr>
                 <w:rFonts w:ascii="Arial" w:hAnsi="Arial" w:cs="Arial"/>
                 <w:bCs/>
-                <w:sz w:val="16"/>
-                <w:szCs w:val="16"/>
+                <w:sz w:val="18"/>
+                <w:szCs w:val="18"/>
               </w:rPr>
             </w:pPr>
           </w:p>
@@ -427,16 +427,16 @@
               <w:rPr>
                 <w:rFonts w:ascii="Arial" w:hAnsi="Arial" w:cs="Arial"/>
                 <w:b/>
-                <w:sz w:val="16"/>
-                <w:szCs w:val="16"/>
-              </w:rPr>
-            </w:pPr>
-            <w:r>
-              <w:rPr>
-                <w:rFonts w:ascii="Arial" w:hAnsi="Arial" w:cs="Arial"/>
-                <w:b/>
-                <w:sz w:val="16"/>
-                <w:szCs w:val="16"/>
+                <w:sz w:val="18"/>
+                <w:szCs w:val="18"/>
+              </w:rPr>
+            </w:pPr>
+            <w:r>
+              <w:rPr>
+                <w:rFonts w:ascii="Arial" w:hAnsi="Arial" w:cs="Arial"/>
+                <w:b/>
+                <w:sz w:val="18"/>
+                <w:szCs w:val="18"/>
               </w:rPr>
               <w:t>Contato:</w:t>
             </w:r>
@@ -457,16 +457,16 @@
               <w:rPr>
                 <w:rFonts w:ascii="Arial" w:hAnsi="Arial" w:cs="Arial"/>
                 <w:bCs/>
-                <w:sz w:val="16"/>
-                <w:szCs w:val="16"/>
-              </w:rPr>
-            </w:pPr>
-            <w:r>
-              <w:rPr>
-                <w:rFonts w:ascii="Arial" w:hAnsi="Arial" w:cs="Arial"/>
-                <w:bCs/>
-                <w:sz w:val="16"/>
-                <w:szCs w:val="16"/>
+                <w:sz w:val="18"/>
+                <w:szCs w:val="18"/>
+              </w:rPr>
+            </w:pPr>
+            <w:r>
+              <w:rPr>
+                <w:rFonts w:ascii="Arial" w:hAnsi="Arial" w:cs="Arial"/>
+                <w:bCs/>
+                <w:sz w:val="18"/>
+                <w:szCs w:val="18"/>
               </w:rPr>
               <w:t xml:space="preserve"> </w:t>
             </w:r>
@@ -495,16 +495,16 @@
               <w:rPr>
                 <w:rFonts w:ascii="Arial" w:hAnsi="Arial" w:cs="Arial"/>
                 <w:b/>
-                <w:sz w:val="16"/>
-                <w:szCs w:val="16"/>
-              </w:rPr>
-            </w:pPr>
-            <w:r>
-              <w:rPr>
-                <w:rFonts w:ascii="Arial" w:hAnsi="Arial" w:cs="Arial"/>
-                <w:b/>
-                <w:sz w:val="16"/>
-                <w:szCs w:val="16"/>
+                <w:sz w:val="18"/>
+                <w:szCs w:val="18"/>
+              </w:rPr>
+            </w:pPr>
+            <w:r>
+              <w:rPr>
+                <w:rFonts w:ascii="Arial" w:hAnsi="Arial" w:cs="Arial"/>
+                <w:b/>
+                <w:sz w:val="18"/>
+                <w:szCs w:val="18"/>
               </w:rPr>
               <w:t>Cidade</w:t>
             </w:r>
@@ -512,8 +512,8 @@
               <w:rPr>
                 <w:rFonts w:ascii="Arial" w:hAnsi="Arial" w:cs="Arial"/>
                 <w:b/>
-                <w:sz w:val="16"/>
-                <w:szCs w:val="16"/>
+                <w:sz w:val="18"/>
+                <w:szCs w:val="18"/>
               </w:rPr>
               <w:t>:</w:t>
             </w:r>
@@ -534,8 +534,8 @@
               <w:rPr>
                 <w:rFonts w:ascii="Arial" w:hAnsi="Arial" w:cs="Arial"/>
                 <w:bCs/>
-                <w:sz w:val="16"/>
-                <w:szCs w:val="16"/>
+                <w:sz w:val="18"/>
+                <w:szCs w:val="18"/>
               </w:rPr>
             </w:pPr>
           </w:p>
@@ -558,16 +558,16 @@
               <w:rPr>
                 <w:rFonts w:ascii="Arial" w:hAnsi="Arial" w:cs="Arial"/>
                 <w:b/>
-                <w:sz w:val="16"/>
-                <w:szCs w:val="16"/>
-              </w:rPr>
-            </w:pPr>
-            <w:r>
-              <w:rPr>
-                <w:rFonts w:ascii="Arial" w:hAnsi="Arial" w:cs="Arial"/>
-                <w:b/>
-                <w:sz w:val="16"/>
-                <w:szCs w:val="16"/>
+                <w:sz w:val="18"/>
+                <w:szCs w:val="18"/>
+              </w:rPr>
+            </w:pPr>
+            <w:r>
+              <w:rPr>
+                <w:rFonts w:ascii="Arial" w:hAnsi="Arial" w:cs="Arial"/>
+                <w:b/>
+                <w:sz w:val="18"/>
+                <w:szCs w:val="18"/>
               </w:rPr>
               <w:t>Telefone:</w:t>
             </w:r>
@@ -588,16 +588,16 @@
               <w:rPr>
                 <w:rFonts w:ascii="Arial" w:hAnsi="Arial" w:cs="Arial"/>
                 <w:bCs/>
-                <w:sz w:val="16"/>
-                <w:szCs w:val="16"/>
-              </w:rPr>
-            </w:pPr>
-            <w:r>
-              <w:rPr>
-                <w:rFonts w:ascii="Arial" w:hAnsi="Arial" w:cs="Arial"/>
-                <w:bCs/>
-                <w:sz w:val="16"/>
-                <w:szCs w:val="16"/>
+                <w:sz w:val="18"/>
+                <w:szCs w:val="18"/>
+              </w:rPr>
+            </w:pPr>
+            <w:r>
+              <w:rPr>
+                <w:rFonts w:ascii="Arial" w:hAnsi="Arial" w:cs="Arial"/>
+                <w:bCs/>
+                <w:sz w:val="18"/>
+                <w:szCs w:val="18"/>
               </w:rPr>
               <w:t xml:space="preserve"> </w:t>
             </w:r>
@@ -629,16 +629,16 @@
               <w:rPr>
                 <w:rFonts w:ascii="Arial" w:hAnsi="Arial" w:cs="Arial"/>
                 <w:b/>
-                <w:sz w:val="16"/>
-                <w:szCs w:val="16"/>
-              </w:rPr>
-            </w:pPr>
-            <w:r>
-              <w:rPr>
-                <w:rFonts w:ascii="Arial" w:hAnsi="Arial" w:cs="Arial"/>
-                <w:b/>
-                <w:sz w:val="16"/>
-                <w:szCs w:val="16"/>
+                <w:sz w:val="18"/>
+                <w:szCs w:val="18"/>
+              </w:rPr>
+            </w:pPr>
+            <w:r>
+              <w:rPr>
+                <w:rFonts w:ascii="Arial" w:hAnsi="Arial" w:cs="Arial"/>
+                <w:b/>
+                <w:sz w:val="18"/>
+                <w:szCs w:val="18"/>
               </w:rPr>
               <w:t>Bairro:</w:t>
             </w:r>
@@ -659,8 +659,8 @@
               <w:rPr>
                 <w:rFonts w:ascii="Arial" w:hAnsi="Arial" w:cs="Arial"/>
                 <w:bCs/>
-                <w:sz w:val="16"/>
-                <w:szCs w:val="16"/>
+                <w:sz w:val="18"/>
+                <w:szCs w:val="18"/>
               </w:rPr>
             </w:pPr>
           </w:p>
@@ -683,16 +683,16 @@
               <w:rPr>
                 <w:rFonts w:ascii="Arial" w:hAnsi="Arial" w:cs="Arial"/>
                 <w:b/>
-                <w:sz w:val="16"/>
-                <w:szCs w:val="16"/>
-              </w:rPr>
-            </w:pPr>
-            <w:r>
-              <w:rPr>
-                <w:rFonts w:ascii="Arial" w:hAnsi="Arial" w:cs="Arial"/>
-                <w:b/>
-                <w:sz w:val="16"/>
-                <w:szCs w:val="16"/>
+                <w:sz w:val="18"/>
+                <w:szCs w:val="18"/>
+              </w:rPr>
+            </w:pPr>
+            <w:r>
+              <w:rPr>
+                <w:rFonts w:ascii="Arial" w:hAnsi="Arial" w:cs="Arial"/>
+                <w:b/>
+                <w:sz w:val="18"/>
+                <w:szCs w:val="18"/>
               </w:rPr>
               <w:t>Endereço:</w:t>
             </w:r>
@@ -713,8 +713,8 @@
               <w:rPr>
                 <w:rFonts w:ascii="Arial" w:hAnsi="Arial" w:cs="Arial"/>
                 <w:bCs/>
-                <w:sz w:val="16"/>
-                <w:szCs w:val="16"/>
+                <w:sz w:val="18"/>
+                <w:szCs w:val="18"/>
               </w:rPr>
             </w:pPr>
           </w:p>
@@ -735,16 +735,16 @@
               <w:rPr>
                 <w:rFonts w:ascii="Arial" w:hAnsi="Arial" w:cs="Arial"/>
                 <w:b/>
-                <w:sz w:val="16"/>
-                <w:szCs w:val="16"/>
-              </w:rPr>
-            </w:pPr>
-            <w:r>
-              <w:rPr>
-                <w:rFonts w:ascii="Arial" w:hAnsi="Arial" w:cs="Arial"/>
-                <w:b/>
-                <w:sz w:val="16"/>
-                <w:szCs w:val="16"/>
+                <w:sz w:val="18"/>
+                <w:szCs w:val="18"/>
+              </w:rPr>
+            </w:pPr>
+            <w:r>
+              <w:rPr>
+                <w:rFonts w:ascii="Arial" w:hAnsi="Arial" w:cs="Arial"/>
+                <w:b/>
+                <w:sz w:val="18"/>
+                <w:szCs w:val="18"/>
               </w:rPr>
               <w:t>Ponto De Referência:</w:t>
             </w:r>
@@ -765,8 +765,8 @@
               <w:rPr>
                 <w:rFonts w:ascii="Arial" w:hAnsi="Arial" w:cs="Arial"/>
                 <w:bCs/>
-                <w:sz w:val="16"/>
-                <w:szCs w:val="16"/>
+                <w:sz w:val="18"/>
+                <w:szCs w:val="18"/>
               </w:rPr>
             </w:pPr>
           </w:p>
@@ -794,17 +794,17 @@
                 <w:rFonts w:ascii="Arial" w:hAnsi="Arial" w:cs="Arial"/>
                 <w:b/>
                 <w:bCs/>
-                <w:sz w:val="16"/>
-                <w:szCs w:val="16"/>
-              </w:rPr>
-            </w:pPr>
-            <w:r>
-              <w:rPr>
-                <w:rFonts w:ascii="Arial" w:hAnsi="Arial" w:cs="Arial"/>
-                <w:b/>
-                <w:bCs/>
-                <w:sz w:val="16"/>
-                <w:szCs w:val="16"/>
+                <w:sz w:val="18"/>
+                <w:szCs w:val="18"/>
+              </w:rPr>
+            </w:pPr>
+            <w:r>
+              <w:rPr>
+                <w:rFonts w:ascii="Arial" w:hAnsi="Arial" w:cs="Arial"/>
+                <w:b/>
+                <w:bCs/>
+                <w:sz w:val="18"/>
+                <w:szCs w:val="18"/>
               </w:rPr>
               <w:t>IDENTIFICAÇÃO DO PRODUTO</w:t>
             </w:r>
@@ -830,17 +830,17 @@
                 <w:rFonts w:ascii="Arial" w:hAnsi="Arial" w:cs="Arial"/>
                 <w:b/>
                 <w:bCs/>
-                <w:sz w:val="16"/>
-                <w:szCs w:val="16"/>
-              </w:rPr>
-            </w:pPr>
-            <w:r>
-              <w:rPr>
-                <w:rFonts w:ascii="Arial" w:hAnsi="Arial" w:cs="Arial"/>
-                <w:b/>
-                <w:bCs/>
-                <w:sz w:val="16"/>
-                <w:szCs w:val="16"/>
+                <w:sz w:val="18"/>
+                <w:szCs w:val="18"/>
+              </w:rPr>
+            </w:pPr>
+            <w:r>
+              <w:rPr>
+                <w:rFonts w:ascii="Arial" w:hAnsi="Arial" w:cs="Arial"/>
+                <w:b/>
+                <w:bCs/>
+                <w:sz w:val="18"/>
+                <w:szCs w:val="18"/>
               </w:rPr>
               <w:t>Produto:</w:t>
             </w:r>
@@ -861,8 +861,8 @@
                 <w:rFonts w:ascii="Arial" w:hAnsi="Arial" w:cs="Arial"/>
                 <w:b/>
                 <w:bCs/>
-                <w:sz w:val="16"/>
-                <w:szCs w:val="16"/>
+                <w:sz w:val="18"/>
+                <w:szCs w:val="18"/>
               </w:rPr>
             </w:pPr>
           </w:p>
@@ -882,17 +882,17 @@
                 <w:rFonts w:ascii="Arial" w:hAnsi="Arial" w:cs="Arial"/>
                 <w:b/>
                 <w:bCs/>
-                <w:sz w:val="16"/>
-                <w:szCs w:val="16"/>
-              </w:rPr>
-            </w:pPr>
-            <w:r>
-              <w:rPr>
-                <w:rFonts w:ascii="Arial" w:hAnsi="Arial" w:cs="Arial"/>
-                <w:b/>
-                <w:bCs/>
-                <w:sz w:val="16"/>
-                <w:szCs w:val="16"/>
+                <w:sz w:val="18"/>
+                <w:szCs w:val="18"/>
+              </w:rPr>
+            </w:pPr>
+            <w:r>
+              <w:rPr>
+                <w:rFonts w:ascii="Arial" w:hAnsi="Arial" w:cs="Arial"/>
+                <w:b/>
+                <w:bCs/>
+                <w:sz w:val="18"/>
+                <w:szCs w:val="18"/>
               </w:rPr>
               <w:t>Nº Série/Lote Do Produto:</w:t>
             </w:r>
@@ -913,8 +913,8 @@
                 <w:rFonts w:ascii="Arial" w:hAnsi="Arial" w:cs="Arial"/>
                 <w:b/>
                 <w:bCs/>
-                <w:sz w:val="16"/>
-                <w:szCs w:val="16"/>
+                <w:sz w:val="18"/>
+                <w:szCs w:val="18"/>
               </w:rPr>
             </w:pPr>
           </w:p>
@@ -939,17 +939,17 @@
                 <w:rFonts w:ascii="Arial" w:hAnsi="Arial" w:cs="Arial"/>
                 <w:b/>
                 <w:bCs/>
-                <w:sz w:val="16"/>
-                <w:szCs w:val="16"/>
-              </w:rPr>
-            </w:pPr>
-            <w:r>
-              <w:rPr>
-                <w:rFonts w:ascii="Arial" w:hAnsi="Arial" w:cs="Arial"/>
-                <w:b/>
-                <w:bCs/>
-                <w:sz w:val="16"/>
-                <w:szCs w:val="16"/>
+                <w:sz w:val="18"/>
+                <w:szCs w:val="18"/>
+              </w:rPr>
+            </w:pPr>
+            <w:r>
+              <w:rPr>
+                <w:rFonts w:ascii="Arial" w:hAnsi="Arial" w:cs="Arial"/>
+                <w:b/>
+                <w:bCs/>
+                <w:sz w:val="18"/>
+                <w:szCs w:val="18"/>
               </w:rPr>
               <w:t xml:space="preserve">Data Emissão </w:t>
             </w:r>
@@ -959,8 +959,8 @@
                 <w:rFonts w:ascii="Arial" w:hAnsi="Arial" w:cs="Arial"/>
                 <w:b/>
                 <w:bCs/>
-                <w:sz w:val="16"/>
-                <w:szCs w:val="16"/>
+                <w:sz w:val="18"/>
+                <w:szCs w:val="18"/>
               </w:rPr>
               <w:t>Nf</w:t>
             </w:r>
@@ -970,8 +970,8 @@
                 <w:rFonts w:ascii="Arial" w:hAnsi="Arial" w:cs="Arial"/>
                 <w:b/>
                 <w:bCs/>
-                <w:sz w:val="16"/>
-                <w:szCs w:val="16"/>
+                <w:sz w:val="18"/>
+                <w:szCs w:val="18"/>
               </w:rPr>
               <w:t>:</w:t>
             </w:r>
@@ -992,8 +992,8 @@
                 <w:rFonts w:ascii="Arial" w:hAnsi="Arial" w:cs="Arial"/>
                 <w:b/>
                 <w:bCs/>
-                <w:sz w:val="16"/>
-                <w:szCs w:val="16"/>
+                <w:sz w:val="18"/>
+                <w:szCs w:val="18"/>
               </w:rPr>
             </w:pPr>
           </w:p>
@@ -1013,17 +1013,17 @@
                 <w:rFonts w:ascii="Arial" w:hAnsi="Arial" w:cs="Arial"/>
                 <w:b/>
                 <w:bCs/>
-                <w:sz w:val="16"/>
-                <w:szCs w:val="16"/>
-              </w:rPr>
-            </w:pPr>
-            <w:r>
-              <w:rPr>
-                <w:rFonts w:ascii="Arial" w:hAnsi="Arial" w:cs="Arial"/>
-                <w:b/>
-                <w:bCs/>
-                <w:sz w:val="16"/>
-                <w:szCs w:val="16"/>
+                <w:sz w:val="18"/>
+                <w:szCs w:val="18"/>
+              </w:rPr>
+            </w:pPr>
+            <w:r>
+              <w:rPr>
+                <w:rFonts w:ascii="Arial" w:hAnsi="Arial" w:cs="Arial"/>
+                <w:b/>
+                <w:bCs/>
+                <w:sz w:val="18"/>
+                <w:szCs w:val="18"/>
               </w:rPr>
               <w:t>Nota Fiscal Nº:</w:t>
             </w:r>
@@ -1044,8 +1044,8 @@
                 <w:rFonts w:ascii="Arial" w:hAnsi="Arial" w:cs="Arial"/>
                 <w:b/>
                 <w:bCs/>
-                <w:sz w:val="16"/>
-                <w:szCs w:val="16"/>
+                <w:sz w:val="18"/>
+                <w:szCs w:val="18"/>
               </w:rPr>
             </w:pPr>
           </w:p>
@@ -1070,17 +1070,17 @@
                 <w:rFonts w:ascii="Arial" w:hAnsi="Arial" w:cs="Arial"/>
                 <w:b/>
                 <w:bCs/>
-                <w:sz w:val="16"/>
-                <w:szCs w:val="16"/>
-              </w:rPr>
-            </w:pPr>
-            <w:r>
-              <w:rPr>
-                <w:rFonts w:ascii="Arial" w:hAnsi="Arial" w:cs="Arial"/>
-                <w:b/>
-                <w:bCs/>
-                <w:sz w:val="16"/>
-                <w:szCs w:val="16"/>
+                <w:sz w:val="18"/>
+                <w:szCs w:val="18"/>
+              </w:rPr>
+            </w:pPr>
+            <w:r>
+              <w:rPr>
+                <w:rFonts w:ascii="Arial" w:hAnsi="Arial" w:cs="Arial"/>
+                <w:b/>
+                <w:bCs/>
+                <w:sz w:val="18"/>
+                <w:szCs w:val="18"/>
               </w:rPr>
               <w:t>Quantidade:</w:t>
             </w:r>
@@ -1101,8 +1101,8 @@
                 <w:rFonts w:ascii="Arial" w:hAnsi="Arial" w:cs="Arial"/>
                 <w:b/>
                 <w:bCs/>
-                <w:sz w:val="16"/>
-                <w:szCs w:val="16"/>
+                <w:sz w:val="18"/>
+                <w:szCs w:val="18"/>
               </w:rPr>
             </w:pPr>
           </w:p>
@@ -1122,17 +1122,17 @@
                 <w:rFonts w:ascii="Arial" w:hAnsi="Arial" w:cs="Arial"/>
                 <w:b/>
                 <w:bCs/>
-                <w:sz w:val="16"/>
-                <w:szCs w:val="16"/>
-              </w:rPr>
-            </w:pPr>
-            <w:r>
-              <w:rPr>
-                <w:rFonts w:ascii="Arial" w:hAnsi="Arial" w:cs="Arial"/>
-                <w:b/>
-                <w:bCs/>
-                <w:sz w:val="16"/>
-                <w:szCs w:val="16"/>
+                <w:sz w:val="18"/>
+                <w:szCs w:val="18"/>
+              </w:rPr>
+            </w:pPr>
+            <w:r>
+              <w:rPr>
+                <w:rFonts w:ascii="Arial" w:hAnsi="Arial" w:cs="Arial"/>
+                <w:b/>
+                <w:bCs/>
+                <w:sz w:val="18"/>
+                <w:szCs w:val="18"/>
               </w:rPr>
               <w:t>Pedido Nº:</w:t>
             </w:r>
@@ -1153,8 +1153,8 @@
                 <w:rFonts w:ascii="Arial" w:hAnsi="Arial" w:cs="Arial"/>
                 <w:b/>
                 <w:bCs/>
-                <w:sz w:val="16"/>
-                <w:szCs w:val="16"/>
+                <w:sz w:val="18"/>
+                <w:szCs w:val="18"/>
               </w:rPr>
             </w:pPr>
           </w:p>
@@ -1179,17 +1179,17 @@
                 <w:rFonts w:ascii="Arial" w:hAnsi="Arial" w:cs="Arial"/>
                 <w:b/>
                 <w:bCs/>
-                <w:sz w:val="16"/>
-                <w:szCs w:val="16"/>
-              </w:rPr>
-            </w:pPr>
-            <w:r>
-              <w:rPr>
-                <w:rFonts w:ascii="Arial" w:hAnsi="Arial" w:cs="Arial"/>
-                <w:b/>
-                <w:bCs/>
-                <w:sz w:val="16"/>
-                <w:szCs w:val="16"/>
+                <w:sz w:val="18"/>
+                <w:szCs w:val="18"/>
+              </w:rPr>
+            </w:pPr>
+            <w:r>
+              <w:rPr>
+                <w:rFonts w:ascii="Arial" w:hAnsi="Arial" w:cs="Arial"/>
+                <w:b/>
+                <w:bCs/>
+                <w:sz w:val="18"/>
+                <w:szCs w:val="18"/>
               </w:rPr>
               <w:t>1 - RECLAMAÇÃO / SUGESTÃO</w:t>
             </w:r>
@@ -1215,17 +1215,17 @@
                 <w:rFonts w:ascii="Arial" w:hAnsi="Arial" w:cs="Arial"/>
                 <w:b/>
                 <w:bCs/>
-                <w:sz w:val="16"/>
-                <w:szCs w:val="16"/>
-              </w:rPr>
-            </w:pPr>
-            <w:r>
-              <w:rPr>
-                <w:rFonts w:ascii="Arial" w:hAnsi="Arial" w:cs="Arial"/>
-                <w:b/>
-                <w:bCs/>
-                <w:sz w:val="16"/>
-                <w:szCs w:val="16"/>
+                <w:sz w:val="18"/>
+                <w:szCs w:val="18"/>
+              </w:rPr>
+            </w:pPr>
+            <w:r>
+              <w:rPr>
+                <w:rFonts w:ascii="Arial" w:hAnsi="Arial" w:cs="Arial"/>
+                <w:b/>
+                <w:bCs/>
+                <w:sz w:val="18"/>
+                <w:szCs w:val="18"/>
               </w:rPr>
               <w:t>Tipo de reclamação</w:t>
             </w:r>
@@ -1246,8 +1246,8 @@
                 <w:rFonts w:ascii="Arial" w:hAnsi="Arial" w:cs="Arial"/>
                 <w:b/>
                 <w:bCs/>
-                <w:sz w:val="16"/>
-                <w:szCs w:val="16"/>
+                <w:sz w:val="18"/>
+                <w:szCs w:val="18"/>
               </w:rPr>
             </w:pPr>
           </w:p>
@@ -1272,17 +1272,17 @@
                 <w:rFonts w:ascii="Arial" w:hAnsi="Arial" w:cs="Arial"/>
                 <w:b/>
                 <w:bCs/>
-                <w:sz w:val="16"/>
-                <w:szCs w:val="16"/>
-              </w:rPr>
-            </w:pPr>
-            <w:r>
-              <w:rPr>
-                <w:rFonts w:ascii="Arial" w:hAnsi="Arial" w:cs="Arial"/>
-                <w:b/>
-                <w:bCs/>
-                <w:sz w:val="16"/>
-                <w:szCs w:val="16"/>
+                <w:sz w:val="18"/>
+                <w:szCs w:val="18"/>
+              </w:rPr>
+            </w:pPr>
+            <w:r>
+              <w:rPr>
+                <w:rFonts w:ascii="Arial" w:hAnsi="Arial" w:cs="Arial"/>
+                <w:b/>
+                <w:bCs/>
+                <w:sz w:val="18"/>
+                <w:szCs w:val="18"/>
               </w:rPr>
               <w:t>DESCRIÇÃO DA RECLAMAÇÃO:</w:t>
             </w:r>
@@ -1308,8 +1308,8 @@
                 <w:rFonts w:ascii="Arial" w:hAnsi="Arial" w:cs="Arial"/>
                 <w:b/>
                 <w:bCs/>
-                <w:sz w:val="16"/>
-                <w:szCs w:val="16"/>
+                <w:sz w:val="18"/>
+                <w:szCs w:val="18"/>
               </w:rPr>
             </w:pPr>
           </w:p>
@@ -1334,17 +1334,17 @@
                 <w:rFonts w:ascii="Arial" w:hAnsi="Arial" w:cs="Arial"/>
                 <w:b/>
                 <w:bCs/>
-                <w:sz w:val="16"/>
-                <w:szCs w:val="16"/>
-              </w:rPr>
-            </w:pPr>
-            <w:r>
-              <w:rPr>
-                <w:rFonts w:ascii="Arial" w:hAnsi="Arial" w:cs="Arial"/>
-                <w:b/>
-                <w:bCs/>
-                <w:sz w:val="16"/>
-                <w:szCs w:val="16"/>
+                <w:sz w:val="18"/>
+                <w:szCs w:val="18"/>
+              </w:rPr>
+            </w:pPr>
+            <w:r>
+              <w:rPr>
+                <w:rFonts w:ascii="Arial" w:hAnsi="Arial" w:cs="Arial"/>
+                <w:b/>
+                <w:bCs/>
+                <w:sz w:val="18"/>
+                <w:szCs w:val="18"/>
               </w:rPr>
               <w:t>2 – ANÁLISE DA RECLAMAÇÃO</w:t>
             </w:r>
@@ -1370,17 +1370,17 @@
                 <w:rFonts w:ascii="Arial" w:hAnsi="Arial" w:cs="Arial"/>
                 <w:b/>
                 <w:bCs/>
-                <w:sz w:val="16"/>
-                <w:szCs w:val="16"/>
-              </w:rPr>
-            </w:pPr>
-            <w:r>
-              <w:rPr>
-                <w:rFonts w:ascii="Arial" w:hAnsi="Arial" w:cs="Arial"/>
-                <w:b/>
-                <w:bCs/>
-                <w:sz w:val="16"/>
-                <w:szCs w:val="16"/>
+                <w:sz w:val="18"/>
+                <w:szCs w:val="18"/>
+              </w:rPr>
+            </w:pPr>
+            <w:r>
+              <w:rPr>
+                <w:rFonts w:ascii="Arial" w:hAnsi="Arial" w:cs="Arial"/>
+                <w:b/>
+                <w:bCs/>
+                <w:sz w:val="18"/>
+                <w:szCs w:val="18"/>
               </w:rPr>
               <w:t>Reclamação Aceita?</w:t>
             </w:r>
@@ -1401,8 +1401,8 @@
                 <w:rFonts w:ascii="Arial" w:hAnsi="Arial" w:cs="Arial"/>
                 <w:b/>
                 <w:bCs/>
-                <w:sz w:val="16"/>
-                <w:szCs w:val="16"/>
+                <w:sz w:val="18"/>
+                <w:szCs w:val="18"/>
               </w:rPr>
             </w:pPr>
           </w:p>
@@ -1422,17 +1422,17 @@
                 <w:rFonts w:ascii="Arial" w:hAnsi="Arial" w:cs="Arial"/>
                 <w:b/>
                 <w:bCs/>
-                <w:sz w:val="16"/>
-                <w:szCs w:val="16"/>
-              </w:rPr>
-            </w:pPr>
-            <w:r>
-              <w:rPr>
-                <w:rFonts w:ascii="Arial" w:hAnsi="Arial" w:cs="Arial"/>
-                <w:b/>
-                <w:bCs/>
-                <w:sz w:val="16"/>
-                <w:szCs w:val="16"/>
+                <w:sz w:val="18"/>
+                <w:szCs w:val="18"/>
+              </w:rPr>
+            </w:pPr>
+            <w:r>
+              <w:rPr>
+                <w:rFonts w:ascii="Arial" w:hAnsi="Arial" w:cs="Arial"/>
+                <w:b/>
+                <w:bCs/>
+                <w:sz w:val="18"/>
+                <w:szCs w:val="18"/>
               </w:rPr>
               <w:t>Dentro da garantia?</w:t>
             </w:r>
@@ -1453,8 +1453,8 @@
                 <w:rFonts w:ascii="Arial" w:hAnsi="Arial" w:cs="Arial"/>
                 <w:b/>
                 <w:bCs/>
-                <w:sz w:val="16"/>
-                <w:szCs w:val="16"/>
+                <w:sz w:val="18"/>
+                <w:szCs w:val="18"/>
               </w:rPr>
             </w:pPr>
           </w:p>
@@ -1474,17 +1474,17 @@
                 <w:rFonts w:ascii="Arial" w:hAnsi="Arial" w:cs="Arial"/>
                 <w:b/>
                 <w:bCs/>
-                <w:sz w:val="16"/>
-                <w:szCs w:val="16"/>
-              </w:rPr>
-            </w:pPr>
-            <w:r>
-              <w:rPr>
-                <w:rFonts w:ascii="Arial" w:hAnsi="Arial" w:cs="Arial"/>
-                <w:b/>
-                <w:bCs/>
-                <w:sz w:val="16"/>
-                <w:szCs w:val="16"/>
+                <w:sz w:val="18"/>
+                <w:szCs w:val="18"/>
+              </w:rPr>
+            </w:pPr>
+            <w:r>
+              <w:rPr>
+                <w:rFonts w:ascii="Arial" w:hAnsi="Arial" w:cs="Arial"/>
+                <w:b/>
+                <w:bCs/>
+                <w:sz w:val="18"/>
+                <w:szCs w:val="18"/>
               </w:rPr>
               <w:t>Abrir Ordem De Serviço?</w:t>
             </w:r>
@@ -1505,8 +1505,8 @@
                 <w:rFonts w:ascii="Arial" w:hAnsi="Arial" w:cs="Arial"/>
                 <w:b/>
                 <w:bCs/>
-                <w:sz w:val="16"/>
-                <w:szCs w:val="16"/>
+                <w:sz w:val="18"/>
+                <w:szCs w:val="18"/>
               </w:rPr>
             </w:pPr>
           </w:p>
@@ -1531,17 +1531,17 @@
                 <w:rFonts w:ascii="Arial" w:hAnsi="Arial" w:cs="Arial"/>
                 <w:b/>
                 <w:bCs/>
-                <w:sz w:val="16"/>
-                <w:szCs w:val="16"/>
-              </w:rPr>
-            </w:pPr>
-            <w:r>
-              <w:rPr>
-                <w:rFonts w:ascii="Arial" w:hAnsi="Arial" w:cs="Arial"/>
-                <w:b/>
-                <w:bCs/>
-                <w:sz w:val="16"/>
-                <w:szCs w:val="16"/>
+                <w:sz w:val="18"/>
+                <w:szCs w:val="18"/>
+              </w:rPr>
+            </w:pPr>
+            <w:r>
+              <w:rPr>
+                <w:rFonts w:ascii="Arial" w:hAnsi="Arial" w:cs="Arial"/>
+                <w:b/>
+                <w:bCs/>
+                <w:sz w:val="18"/>
+                <w:szCs w:val="18"/>
               </w:rPr>
               <w:t>Comentário</w:t>
             </w:r>
@@ -1562,8 +1562,8 @@
                 <w:rFonts w:ascii="Arial" w:hAnsi="Arial" w:cs="Arial"/>
                 <w:b/>
                 <w:bCs/>
-                <w:sz w:val="16"/>
-                <w:szCs w:val="16"/>
+                <w:sz w:val="18"/>
+                <w:szCs w:val="18"/>
               </w:rPr>
             </w:pPr>
           </w:p>
@@ -1588,8 +1588,8 @@
                 <w:rFonts w:ascii="Arial" w:hAnsi="Arial" w:cs="Arial"/>
                 <w:b/>
                 <w:bCs/>
-                <w:sz w:val="16"/>
-                <w:szCs w:val="16"/>
+                <w:sz w:val="18"/>
+                <w:szCs w:val="18"/>
               </w:rPr>
             </w:pPr>
             <w:r>
@@ -1598,8 +1598,8 @@
                 <w:b/>
                 <w:bCs/>
                 <w:i/>
-                <w:sz w:val="16"/>
-                <w:szCs w:val="16"/>
+                <w:sz w:val="18"/>
+                <w:szCs w:val="18"/>
               </w:rPr>
               <w:t>Responsável pela análise</w:t>
             </w:r>
@@ -1620,8 +1620,8 @@
                 <w:rFonts w:ascii="Arial" w:hAnsi="Arial" w:cs="Arial"/>
                 <w:b/>
                 <w:bCs/>
-                <w:sz w:val="16"/>
-                <w:szCs w:val="16"/>
+                <w:sz w:val="18"/>
+                <w:szCs w:val="18"/>
               </w:rPr>
             </w:pPr>
           </w:p>
@@ -1646,17 +1646,17 @@
                 <w:rFonts w:ascii="Arial" w:hAnsi="Arial" w:cs="Arial"/>
                 <w:b/>
                 <w:bCs/>
-                <w:sz w:val="16"/>
-                <w:szCs w:val="16"/>
-              </w:rPr>
-            </w:pPr>
-            <w:r>
-              <w:rPr>
-                <w:rFonts w:ascii="Arial" w:hAnsi="Arial" w:cs="Arial"/>
-                <w:b/>
-                <w:bCs/>
-                <w:sz w:val="16"/>
-                <w:szCs w:val="16"/>
+                <w:sz w:val="18"/>
+                <w:szCs w:val="18"/>
+              </w:rPr>
+            </w:pPr>
+            <w:r>
+              <w:rPr>
+                <w:rFonts w:ascii="Arial" w:hAnsi="Arial" w:cs="Arial"/>
+                <w:b/>
+                <w:bCs/>
+                <w:sz w:val="18"/>
+                <w:szCs w:val="18"/>
               </w:rPr>
               <w:t>4 – CONFIRMAÇÃO DA REALIZAÇÃO DO SERVIÇO</w:t>
             </w:r>
@@ -1682,8 +1682,8 @@
                 <w:rFonts w:ascii="Arial" w:hAnsi="Arial" w:cs="Arial"/>
                 <w:b/>
                 <w:bCs/>
-                <w:sz w:val="16"/>
-                <w:szCs w:val="16"/>
+                <w:sz w:val="18"/>
+                <w:szCs w:val="18"/>
               </w:rPr>
             </w:pPr>
           </w:p>
@@ -1703,8 +1703,8 @@
                 <w:rFonts w:ascii="Arial" w:hAnsi="Arial" w:cs="Arial"/>
                 <w:b/>
                 <w:bCs/>
-                <w:sz w:val="16"/>
-                <w:szCs w:val="16"/>
+                <w:sz w:val="18"/>
+                <w:szCs w:val="18"/>
               </w:rPr>
             </w:pPr>
           </w:p>
@@ -1729,8 +1729,8 @@
                 <w:rFonts w:ascii="Arial" w:hAnsi="Arial" w:cs="Arial"/>
                 <w:b/>
                 <w:bCs/>
-                <w:sz w:val="16"/>
-                <w:szCs w:val="16"/>
+                <w:sz w:val="18"/>
+                <w:szCs w:val="18"/>
               </w:rPr>
             </w:pPr>
             <w:r>
@@ -1739,8 +1739,8 @@
                 <w:b/>
                 <w:bCs/>
                 <w:i/>
-                <w:sz w:val="16"/>
-                <w:szCs w:val="16"/>
+                <w:sz w:val="18"/>
+                <w:szCs w:val="18"/>
               </w:rPr>
               <w:t>Administração</w:t>
             </w:r>
@@ -1761,8 +1761,8 @@
                 <w:rFonts w:ascii="Arial" w:hAnsi="Arial" w:cs="Arial"/>
                 <w:b/>
                 <w:bCs/>
-                <w:sz w:val="16"/>
-                <w:szCs w:val="16"/>
+                <w:sz w:val="18"/>
+                <w:szCs w:val="18"/>
               </w:rPr>
             </w:pPr>
             <w:r>
@@ -1771,8 +1771,8 @@
                 <w:b/>
                 <w:bCs/>
                 <w:i/>
-                <w:sz w:val="16"/>
-                <w:szCs w:val="16"/>
+                <w:sz w:val="18"/>
+                <w:szCs w:val="18"/>
               </w:rPr>
               <w:t>Diretoria</w:t>
             </w:r>
@@ -1780,6 +1780,13 @@
         </w:tc>
       </w:tr>
     </w:tbl>
+    <w:p>
+      <w:pPr>
+        <w:rPr>
+          <w:b/>
+        </w:rPr>
+      </w:pPr>
+    </w:p>
     <w:sectPr>
       <w:headerReference w:type="even" r:id="rId7"/>
       <w:headerReference w:type="default" r:id="rId8"/>
@@ -2646,8 +2653,8 @@
     <w:name w:val="Normal"/>
     <w:qFormat/>
     <w:rPr>
-      <w:sz w:val="16"/>
-      <w:szCs w:val="16"/>
+      <w:sz w:val="24"/>
+      <w:szCs w:val="24"/>
     </w:rPr>
   </w:style>
   <w:style w:type="character" w:default="1" w:styleId="Fontepargpadro">
@@ -2720,8 +2727,8 @@
     <w:uiPriority w:val="99"/>
     <w:rsid w:val="005C784D"/>
     <w:rPr>
-      <w:sz w:val="16"/>
-      <w:szCs w:val="16"/>
+      <w:sz w:val="24"/>
+      <w:szCs w:val="24"/>
     </w:rPr>
   </w:style>
   <w:style w:type="paragraph" w:styleId="Rodap">
@@ -2744,8 +2751,8 @@
     <w:uiPriority w:val="99"/>
     <w:rsid w:val="005C784D"/>
     <w:rPr>
-      <w:sz w:val="16"/>
-      <w:szCs w:val="16"/>
+      <w:sz w:val="24"/>
+      <w:szCs w:val="24"/>
     </w:rPr>
   </w:style>
   <w:style w:type="paragraph" w:styleId="Textodebalo">
@@ -2794,8 +2801,8 @@
     <w:unhideWhenUsed/>
     <w:rsid w:val="00C67204"/>
     <w:rPr>
-      <w:sz w:val="16"/>
-      <w:szCs w:val="16"/>
+      <w:sz w:val="20"/>
+      <w:szCs w:val="20"/>
     </w:rPr>
   </w:style>
   <w:style w:type="character" w:customStyle="1" w:styleId="TextodecomentrioChar">

</xml_diff>

<commit_message>
Melhoria no preenchimento de cliente de rrcc
</commit_message>
<xml_diff>
--- a/backend/scripts/sgq/rcc-pdf/templates/cliente.docx
+++ b/backend/scripts/sgq/rcc-pdf/templates/cliente.docx
@@ -53,16 +53,16 @@
               <w:rPr>
                 <w:rFonts w:ascii="Arial" w:hAnsi="Arial" w:cs="Arial"/>
                 <w:b/>
-                <w:sz w:val="26"/>
-                <w:szCs w:val="26"/>
-              </w:rPr>
-            </w:pPr>
-            <w:r>
-              <w:rPr>
-                <w:rFonts w:ascii="Arial" w:hAnsi="Arial" w:cs="Arial"/>
-                <w:b/>
-                <w:sz w:val="26"/>
-                <w:szCs w:val="26"/>
+                <w:sz w:val="16"/>
+                <w:szCs w:val="16"/>
+              </w:rPr>
+            </w:pPr>
+            <w:r>
+              <w:rPr>
+                <w:rFonts w:ascii="Arial" w:hAnsi="Arial" w:cs="Arial"/>
+                <w:b/>
+                <w:sz w:val="16"/>
+                <w:szCs w:val="16"/>
               </w:rPr>
               <w:t>REGISTRO DE RECLAMAÇÃO DE CLIENTE</w:t>
             </w:r>
@@ -70,8 +70,8 @@
               <w:rPr>
                 <w:rFonts w:ascii="Arial" w:hAnsi="Arial" w:cs="Arial"/>
                 <w:b/>
-                <w:sz w:val="26"/>
-                <w:szCs w:val="26"/>
+                <w:sz w:val="16"/>
+                <w:szCs w:val="16"/>
               </w:rPr>
               <w:t xml:space="preserve"> (RCC)</w:t>
             </w:r>
@@ -92,16 +92,16 @@
               <w:rPr>
                 <w:rFonts w:ascii="Arial" w:hAnsi="Arial" w:cs="Arial"/>
                 <w:b/>
-                <w:sz w:val="18"/>
-                <w:szCs w:val="18"/>
-              </w:rPr>
-            </w:pPr>
-            <w:r>
-              <w:rPr>
-                <w:rFonts w:ascii="Arial" w:hAnsi="Arial" w:cs="Arial"/>
-                <w:b/>
-                <w:sz w:val="18"/>
-                <w:szCs w:val="18"/>
+                <w:sz w:val="16"/>
+                <w:szCs w:val="16"/>
+              </w:rPr>
+            </w:pPr>
+            <w:r>
+              <w:rPr>
+                <w:rFonts w:ascii="Arial" w:hAnsi="Arial" w:cs="Arial"/>
+                <w:b/>
+                <w:sz w:val="16"/>
+                <w:szCs w:val="16"/>
               </w:rPr>
               <w:t>Nº Reclamação:</w:t>
             </w:r>
@@ -118,8 +118,8 @@
               <w:rPr>
                 <w:rFonts w:ascii="Arial" w:hAnsi="Arial" w:cs="Arial"/>
                 <w:b/>
-                <w:sz w:val="18"/>
-                <w:szCs w:val="18"/>
+                <w:sz w:val="16"/>
+                <w:szCs w:val="16"/>
               </w:rPr>
             </w:pPr>
           </w:p>
@@ -135,16 +135,16 @@
               <w:rPr>
                 <w:rFonts w:ascii="Arial" w:hAnsi="Arial" w:cs="Arial"/>
                 <w:b/>
-                <w:sz w:val="18"/>
-                <w:szCs w:val="18"/>
-              </w:rPr>
-            </w:pPr>
-            <w:r>
-              <w:rPr>
-                <w:rFonts w:ascii="Arial" w:hAnsi="Arial" w:cs="Arial"/>
-                <w:b/>
-                <w:sz w:val="18"/>
-                <w:szCs w:val="18"/>
+                <w:sz w:val="16"/>
+                <w:szCs w:val="16"/>
+              </w:rPr>
+            </w:pPr>
+            <w:r>
+              <w:rPr>
+                <w:rFonts w:ascii="Arial" w:hAnsi="Arial" w:cs="Arial"/>
+                <w:b/>
+                <w:sz w:val="16"/>
+                <w:szCs w:val="16"/>
               </w:rPr>
               <w:t>Data do registro:</w:t>
             </w:r>
@@ -161,8 +161,8 @@
               <w:rPr>
                 <w:rFonts w:ascii="Arial" w:hAnsi="Arial" w:cs="Arial"/>
                 <w:b/>
-                <w:sz w:val="18"/>
-                <w:szCs w:val="18"/>
+                <w:sz w:val="16"/>
+                <w:szCs w:val="16"/>
               </w:rPr>
             </w:pPr>
           </w:p>
@@ -178,16 +178,16 @@
               <w:rPr>
                 <w:rFonts w:ascii="Arial" w:hAnsi="Arial" w:cs="Arial"/>
                 <w:b/>
-                <w:sz w:val="18"/>
-                <w:szCs w:val="18"/>
-              </w:rPr>
-            </w:pPr>
-            <w:r>
-              <w:rPr>
-                <w:rFonts w:ascii="Arial" w:hAnsi="Arial" w:cs="Arial"/>
-                <w:b/>
-                <w:sz w:val="18"/>
-                <w:szCs w:val="18"/>
+                <w:sz w:val="16"/>
+                <w:szCs w:val="16"/>
+              </w:rPr>
+            </w:pPr>
+            <w:r>
+              <w:rPr>
+                <w:rFonts w:ascii="Arial" w:hAnsi="Arial" w:cs="Arial"/>
+                <w:b/>
+                <w:sz w:val="16"/>
+                <w:szCs w:val="16"/>
               </w:rPr>
               <w:t>Data de fechamento:</w:t>
             </w:r>
@@ -206,8 +206,8 @@
               <w:rPr>
                 <w:rFonts w:ascii="Arial" w:hAnsi="Arial" w:cs="Arial"/>
                 <w:bCs/>
-                <w:sz w:val="18"/>
-                <w:szCs w:val="18"/>
+                <w:sz w:val="16"/>
+                <w:szCs w:val="16"/>
               </w:rPr>
             </w:pPr>
           </w:p>
@@ -224,16 +224,16 @@
               <w:rPr>
                 <w:rFonts w:ascii="Arial" w:hAnsi="Arial" w:cs="Arial"/>
                 <w:b/>
-                <w:sz w:val="18"/>
-                <w:szCs w:val="18"/>
-              </w:rPr>
-            </w:pPr>
-            <w:r>
-              <w:rPr>
-                <w:rFonts w:ascii="Arial" w:hAnsi="Arial" w:cs="Arial"/>
-                <w:bCs/>
-                <w:sz w:val="18"/>
-                <w:szCs w:val="18"/>
+                <w:sz w:val="16"/>
+                <w:szCs w:val="16"/>
+              </w:rPr>
+            </w:pPr>
+            <w:r>
+              <w:rPr>
+                <w:rFonts w:ascii="Arial" w:hAnsi="Arial" w:cs="Arial"/>
+                <w:bCs/>
+                <w:sz w:val="16"/>
+                <w:szCs w:val="16"/>
               </w:rPr>
               <w:t xml:space="preserve"> </w:t>
             </w:r>
@@ -241,8 +241,8 @@
               <w:rPr>
                 <w:rFonts w:ascii="Arial" w:hAnsi="Arial" w:cs="Arial"/>
                 <w:b/>
-                <w:sz w:val="18"/>
-                <w:szCs w:val="18"/>
+                <w:sz w:val="16"/>
+                <w:szCs w:val="16"/>
               </w:rPr>
               <w:t>Status atual:</w:t>
             </w:r>
@@ -259,8 +259,8 @@
               <w:rPr>
                 <w:rFonts w:ascii="Arial" w:hAnsi="Arial" w:cs="Arial"/>
                 <w:b/>
-                <w:sz w:val="18"/>
-                <w:szCs w:val="18"/>
+                <w:sz w:val="16"/>
+                <w:szCs w:val="16"/>
               </w:rPr>
             </w:pPr>
           </w:p>
@@ -284,17 +284,17 @@
               <w:rPr>
                 <w:rFonts w:ascii="Arial" w:hAnsi="Arial" w:cs="Arial"/>
                 <w:bCs/>
-                <w:sz w:val="18"/>
-                <w:szCs w:val="18"/>
-              </w:rPr>
-            </w:pPr>
-            <w:r>
-              <w:rPr>
-                <w:rFonts w:ascii="Arial" w:hAnsi="Arial" w:cs="Arial"/>
-                <w:b/>
-                <w:bCs/>
-                <w:sz w:val="18"/>
-                <w:szCs w:val="18"/>
+                <w:sz w:val="16"/>
+                <w:szCs w:val="16"/>
+              </w:rPr>
+            </w:pPr>
+            <w:r>
+              <w:rPr>
+                <w:rFonts w:ascii="Arial" w:hAnsi="Arial" w:cs="Arial"/>
+                <w:b/>
+                <w:bCs/>
+                <w:sz w:val="16"/>
+                <w:szCs w:val="16"/>
               </w:rPr>
               <w:t>IDENTIFICAÇÃO DO CLIENTE</w:t>
             </w:r>
@@ -315,16 +315,16 @@
               <w:rPr>
                 <w:rFonts w:ascii="Arial" w:hAnsi="Arial" w:cs="Arial"/>
                 <w:b/>
-                <w:sz w:val="18"/>
-                <w:szCs w:val="18"/>
-              </w:rPr>
-            </w:pPr>
-            <w:r>
-              <w:rPr>
-                <w:rFonts w:ascii="Arial" w:hAnsi="Arial" w:cs="Arial"/>
-                <w:b/>
-                <w:sz w:val="18"/>
-                <w:szCs w:val="18"/>
+                <w:sz w:val="16"/>
+                <w:szCs w:val="16"/>
+              </w:rPr>
+            </w:pPr>
+            <w:r>
+              <w:rPr>
+                <w:rFonts w:ascii="Arial" w:hAnsi="Arial" w:cs="Arial"/>
+                <w:b/>
+                <w:sz w:val="16"/>
+                <w:szCs w:val="16"/>
               </w:rPr>
               <w:t>Nome cliente consumidor:</w:t>
             </w:r>
@@ -342,16 +342,16 @@
               <w:rPr>
                 <w:rFonts w:ascii="Arial" w:hAnsi="Arial" w:cs="Arial"/>
                 <w:bCs/>
-                <w:sz w:val="18"/>
-                <w:szCs w:val="18"/>
-              </w:rPr>
-            </w:pPr>
-            <w:r>
-              <w:rPr>
-                <w:rFonts w:ascii="Arial" w:hAnsi="Arial" w:cs="Arial"/>
-                <w:b/>
-                <w:sz w:val="18"/>
-                <w:szCs w:val="18"/>
+                <w:sz w:val="16"/>
+                <w:szCs w:val="16"/>
+              </w:rPr>
+            </w:pPr>
+            <w:r>
+              <w:rPr>
+                <w:rFonts w:ascii="Arial" w:hAnsi="Arial" w:cs="Arial"/>
+                <w:b/>
+                <w:sz w:val="16"/>
+                <w:szCs w:val="16"/>
               </w:rPr>
               <w:t xml:space="preserve"> </w:t>
             </w:r>
@@ -376,16 +376,16 @@
               <w:rPr>
                 <w:rFonts w:ascii="Arial" w:hAnsi="Arial" w:cs="Arial"/>
                 <w:b/>
-                <w:sz w:val="18"/>
-                <w:szCs w:val="18"/>
-              </w:rPr>
-            </w:pPr>
-            <w:r>
-              <w:rPr>
-                <w:rFonts w:ascii="Arial" w:hAnsi="Arial" w:cs="Arial"/>
-                <w:b/>
-                <w:sz w:val="18"/>
-                <w:szCs w:val="18"/>
+                <w:sz w:val="16"/>
+                <w:szCs w:val="16"/>
+              </w:rPr>
+            </w:pPr>
+            <w:r>
+              <w:rPr>
+                <w:rFonts w:ascii="Arial" w:hAnsi="Arial" w:cs="Arial"/>
+                <w:b/>
+                <w:sz w:val="16"/>
+                <w:szCs w:val="16"/>
               </w:rPr>
               <w:t>Nome cliente revendedor</w:t>
             </w:r>
@@ -403,8 +403,8 @@
               <w:rPr>
                 <w:rFonts w:ascii="Arial" w:hAnsi="Arial" w:cs="Arial"/>
                 <w:bCs/>
-                <w:sz w:val="18"/>
-                <w:szCs w:val="18"/>
+                <w:sz w:val="16"/>
+                <w:szCs w:val="16"/>
               </w:rPr>
             </w:pPr>
           </w:p>
@@ -427,16 +427,16 @@
               <w:rPr>
                 <w:rFonts w:ascii="Arial" w:hAnsi="Arial" w:cs="Arial"/>
                 <w:b/>
-                <w:sz w:val="18"/>
-                <w:szCs w:val="18"/>
-              </w:rPr>
-            </w:pPr>
-            <w:r>
-              <w:rPr>
-                <w:rFonts w:ascii="Arial" w:hAnsi="Arial" w:cs="Arial"/>
-                <w:b/>
-                <w:sz w:val="18"/>
-                <w:szCs w:val="18"/>
+                <w:sz w:val="16"/>
+                <w:szCs w:val="16"/>
+              </w:rPr>
+            </w:pPr>
+            <w:r>
+              <w:rPr>
+                <w:rFonts w:ascii="Arial" w:hAnsi="Arial" w:cs="Arial"/>
+                <w:b/>
+                <w:sz w:val="16"/>
+                <w:szCs w:val="16"/>
               </w:rPr>
               <w:t>Contato:</w:t>
             </w:r>
@@ -457,16 +457,16 @@
               <w:rPr>
                 <w:rFonts w:ascii="Arial" w:hAnsi="Arial" w:cs="Arial"/>
                 <w:bCs/>
-                <w:sz w:val="18"/>
-                <w:szCs w:val="18"/>
-              </w:rPr>
-            </w:pPr>
-            <w:r>
-              <w:rPr>
-                <w:rFonts w:ascii="Arial" w:hAnsi="Arial" w:cs="Arial"/>
-                <w:bCs/>
-                <w:sz w:val="18"/>
-                <w:szCs w:val="18"/>
+                <w:sz w:val="16"/>
+                <w:szCs w:val="16"/>
+              </w:rPr>
+            </w:pPr>
+            <w:r>
+              <w:rPr>
+                <w:rFonts w:ascii="Arial" w:hAnsi="Arial" w:cs="Arial"/>
+                <w:bCs/>
+                <w:sz w:val="16"/>
+                <w:szCs w:val="16"/>
               </w:rPr>
               <w:t xml:space="preserve"> </w:t>
             </w:r>
@@ -495,16 +495,16 @@
               <w:rPr>
                 <w:rFonts w:ascii="Arial" w:hAnsi="Arial" w:cs="Arial"/>
                 <w:b/>
-                <w:sz w:val="18"/>
-                <w:szCs w:val="18"/>
-              </w:rPr>
-            </w:pPr>
-            <w:r>
-              <w:rPr>
-                <w:rFonts w:ascii="Arial" w:hAnsi="Arial" w:cs="Arial"/>
-                <w:b/>
-                <w:sz w:val="18"/>
-                <w:szCs w:val="18"/>
+                <w:sz w:val="16"/>
+                <w:szCs w:val="16"/>
+              </w:rPr>
+            </w:pPr>
+            <w:r>
+              <w:rPr>
+                <w:rFonts w:ascii="Arial" w:hAnsi="Arial" w:cs="Arial"/>
+                <w:b/>
+                <w:sz w:val="16"/>
+                <w:szCs w:val="16"/>
               </w:rPr>
               <w:t>Cidade</w:t>
             </w:r>
@@ -512,8 +512,8 @@
               <w:rPr>
                 <w:rFonts w:ascii="Arial" w:hAnsi="Arial" w:cs="Arial"/>
                 <w:b/>
-                <w:sz w:val="18"/>
-                <w:szCs w:val="18"/>
+                <w:sz w:val="16"/>
+                <w:szCs w:val="16"/>
               </w:rPr>
               <w:t>:</w:t>
             </w:r>
@@ -534,8 +534,8 @@
               <w:rPr>
                 <w:rFonts w:ascii="Arial" w:hAnsi="Arial" w:cs="Arial"/>
                 <w:bCs/>
-                <w:sz w:val="18"/>
-                <w:szCs w:val="18"/>
+                <w:sz w:val="16"/>
+                <w:szCs w:val="16"/>
               </w:rPr>
             </w:pPr>
           </w:p>
@@ -558,16 +558,16 @@
               <w:rPr>
                 <w:rFonts w:ascii="Arial" w:hAnsi="Arial" w:cs="Arial"/>
                 <w:b/>
-                <w:sz w:val="18"/>
-                <w:szCs w:val="18"/>
-              </w:rPr>
-            </w:pPr>
-            <w:r>
-              <w:rPr>
-                <w:rFonts w:ascii="Arial" w:hAnsi="Arial" w:cs="Arial"/>
-                <w:b/>
-                <w:sz w:val="18"/>
-                <w:szCs w:val="18"/>
+                <w:sz w:val="16"/>
+                <w:szCs w:val="16"/>
+              </w:rPr>
+            </w:pPr>
+            <w:r>
+              <w:rPr>
+                <w:rFonts w:ascii="Arial" w:hAnsi="Arial" w:cs="Arial"/>
+                <w:b/>
+                <w:sz w:val="16"/>
+                <w:szCs w:val="16"/>
               </w:rPr>
               <w:t>Telefone:</w:t>
             </w:r>
@@ -588,16 +588,16 @@
               <w:rPr>
                 <w:rFonts w:ascii="Arial" w:hAnsi="Arial" w:cs="Arial"/>
                 <w:bCs/>
-                <w:sz w:val="18"/>
-                <w:szCs w:val="18"/>
-              </w:rPr>
-            </w:pPr>
-            <w:r>
-              <w:rPr>
-                <w:rFonts w:ascii="Arial" w:hAnsi="Arial" w:cs="Arial"/>
-                <w:bCs/>
-                <w:sz w:val="18"/>
-                <w:szCs w:val="18"/>
+                <w:sz w:val="16"/>
+                <w:szCs w:val="16"/>
+              </w:rPr>
+            </w:pPr>
+            <w:r>
+              <w:rPr>
+                <w:rFonts w:ascii="Arial" w:hAnsi="Arial" w:cs="Arial"/>
+                <w:bCs/>
+                <w:sz w:val="16"/>
+                <w:szCs w:val="16"/>
               </w:rPr>
               <w:t xml:space="preserve"> </w:t>
             </w:r>
@@ -629,16 +629,16 @@
               <w:rPr>
                 <w:rFonts w:ascii="Arial" w:hAnsi="Arial" w:cs="Arial"/>
                 <w:b/>
-                <w:sz w:val="18"/>
-                <w:szCs w:val="18"/>
-              </w:rPr>
-            </w:pPr>
-            <w:r>
-              <w:rPr>
-                <w:rFonts w:ascii="Arial" w:hAnsi="Arial" w:cs="Arial"/>
-                <w:b/>
-                <w:sz w:val="18"/>
-                <w:szCs w:val="18"/>
+                <w:sz w:val="16"/>
+                <w:szCs w:val="16"/>
+              </w:rPr>
+            </w:pPr>
+            <w:r>
+              <w:rPr>
+                <w:rFonts w:ascii="Arial" w:hAnsi="Arial" w:cs="Arial"/>
+                <w:b/>
+                <w:sz w:val="16"/>
+                <w:szCs w:val="16"/>
               </w:rPr>
               <w:t>Bairro:</w:t>
             </w:r>
@@ -659,8 +659,8 @@
               <w:rPr>
                 <w:rFonts w:ascii="Arial" w:hAnsi="Arial" w:cs="Arial"/>
                 <w:bCs/>
-                <w:sz w:val="18"/>
-                <w:szCs w:val="18"/>
+                <w:sz w:val="16"/>
+                <w:szCs w:val="16"/>
               </w:rPr>
             </w:pPr>
           </w:p>
@@ -683,16 +683,16 @@
               <w:rPr>
                 <w:rFonts w:ascii="Arial" w:hAnsi="Arial" w:cs="Arial"/>
                 <w:b/>
-                <w:sz w:val="18"/>
-                <w:szCs w:val="18"/>
-              </w:rPr>
-            </w:pPr>
-            <w:r>
-              <w:rPr>
-                <w:rFonts w:ascii="Arial" w:hAnsi="Arial" w:cs="Arial"/>
-                <w:b/>
-                <w:sz w:val="18"/>
-                <w:szCs w:val="18"/>
+                <w:sz w:val="16"/>
+                <w:szCs w:val="16"/>
+              </w:rPr>
+            </w:pPr>
+            <w:r>
+              <w:rPr>
+                <w:rFonts w:ascii="Arial" w:hAnsi="Arial" w:cs="Arial"/>
+                <w:b/>
+                <w:sz w:val="16"/>
+                <w:szCs w:val="16"/>
               </w:rPr>
               <w:t>Endereço:</w:t>
             </w:r>
@@ -713,8 +713,8 @@
               <w:rPr>
                 <w:rFonts w:ascii="Arial" w:hAnsi="Arial" w:cs="Arial"/>
                 <w:bCs/>
-                <w:sz w:val="18"/>
-                <w:szCs w:val="18"/>
+                <w:sz w:val="16"/>
+                <w:szCs w:val="16"/>
               </w:rPr>
             </w:pPr>
           </w:p>
@@ -735,16 +735,16 @@
               <w:rPr>
                 <w:rFonts w:ascii="Arial" w:hAnsi="Arial" w:cs="Arial"/>
                 <w:b/>
-                <w:sz w:val="18"/>
-                <w:szCs w:val="18"/>
-              </w:rPr>
-            </w:pPr>
-            <w:r>
-              <w:rPr>
-                <w:rFonts w:ascii="Arial" w:hAnsi="Arial" w:cs="Arial"/>
-                <w:b/>
-                <w:sz w:val="18"/>
-                <w:szCs w:val="18"/>
+                <w:sz w:val="16"/>
+                <w:szCs w:val="16"/>
+              </w:rPr>
+            </w:pPr>
+            <w:r>
+              <w:rPr>
+                <w:rFonts w:ascii="Arial" w:hAnsi="Arial" w:cs="Arial"/>
+                <w:b/>
+                <w:sz w:val="16"/>
+                <w:szCs w:val="16"/>
               </w:rPr>
               <w:t>Ponto De Referência:</w:t>
             </w:r>
@@ -765,8 +765,8 @@
               <w:rPr>
                 <w:rFonts w:ascii="Arial" w:hAnsi="Arial" w:cs="Arial"/>
                 <w:bCs/>
-                <w:sz w:val="18"/>
-                <w:szCs w:val="18"/>
+                <w:sz w:val="16"/>
+                <w:szCs w:val="16"/>
               </w:rPr>
             </w:pPr>
           </w:p>
@@ -794,17 +794,17 @@
                 <w:rFonts w:ascii="Arial" w:hAnsi="Arial" w:cs="Arial"/>
                 <w:b/>
                 <w:bCs/>
-                <w:sz w:val="18"/>
-                <w:szCs w:val="18"/>
-              </w:rPr>
-            </w:pPr>
-            <w:r>
-              <w:rPr>
-                <w:rFonts w:ascii="Arial" w:hAnsi="Arial" w:cs="Arial"/>
-                <w:b/>
-                <w:bCs/>
-                <w:sz w:val="18"/>
-                <w:szCs w:val="18"/>
+                <w:sz w:val="16"/>
+                <w:szCs w:val="16"/>
+              </w:rPr>
+            </w:pPr>
+            <w:r>
+              <w:rPr>
+                <w:rFonts w:ascii="Arial" w:hAnsi="Arial" w:cs="Arial"/>
+                <w:b/>
+                <w:bCs/>
+                <w:sz w:val="16"/>
+                <w:szCs w:val="16"/>
               </w:rPr>
               <w:t>IDENTIFICAÇÃO DO PRODUTO</w:t>
             </w:r>
@@ -830,17 +830,17 @@
                 <w:rFonts w:ascii="Arial" w:hAnsi="Arial" w:cs="Arial"/>
                 <w:b/>
                 <w:bCs/>
-                <w:sz w:val="18"/>
-                <w:szCs w:val="18"/>
-              </w:rPr>
-            </w:pPr>
-            <w:r>
-              <w:rPr>
-                <w:rFonts w:ascii="Arial" w:hAnsi="Arial" w:cs="Arial"/>
-                <w:b/>
-                <w:bCs/>
-                <w:sz w:val="18"/>
-                <w:szCs w:val="18"/>
+                <w:sz w:val="16"/>
+                <w:szCs w:val="16"/>
+              </w:rPr>
+            </w:pPr>
+            <w:r>
+              <w:rPr>
+                <w:rFonts w:ascii="Arial" w:hAnsi="Arial" w:cs="Arial"/>
+                <w:b/>
+                <w:bCs/>
+                <w:sz w:val="16"/>
+                <w:szCs w:val="16"/>
               </w:rPr>
               <w:t>Produto:</w:t>
             </w:r>
@@ -861,8 +861,8 @@
                 <w:rFonts w:ascii="Arial" w:hAnsi="Arial" w:cs="Arial"/>
                 <w:b/>
                 <w:bCs/>
-                <w:sz w:val="18"/>
-                <w:szCs w:val="18"/>
+                <w:sz w:val="16"/>
+                <w:szCs w:val="16"/>
               </w:rPr>
             </w:pPr>
           </w:p>
@@ -882,17 +882,17 @@
                 <w:rFonts w:ascii="Arial" w:hAnsi="Arial" w:cs="Arial"/>
                 <w:b/>
                 <w:bCs/>
-                <w:sz w:val="18"/>
-                <w:szCs w:val="18"/>
-              </w:rPr>
-            </w:pPr>
-            <w:r>
-              <w:rPr>
-                <w:rFonts w:ascii="Arial" w:hAnsi="Arial" w:cs="Arial"/>
-                <w:b/>
-                <w:bCs/>
-                <w:sz w:val="18"/>
-                <w:szCs w:val="18"/>
+                <w:sz w:val="16"/>
+                <w:szCs w:val="16"/>
+              </w:rPr>
+            </w:pPr>
+            <w:r>
+              <w:rPr>
+                <w:rFonts w:ascii="Arial" w:hAnsi="Arial" w:cs="Arial"/>
+                <w:b/>
+                <w:bCs/>
+                <w:sz w:val="16"/>
+                <w:szCs w:val="16"/>
               </w:rPr>
               <w:t>Nº Série/Lote Do Produto:</w:t>
             </w:r>
@@ -913,8 +913,8 @@
                 <w:rFonts w:ascii="Arial" w:hAnsi="Arial" w:cs="Arial"/>
                 <w:b/>
                 <w:bCs/>
-                <w:sz w:val="18"/>
-                <w:szCs w:val="18"/>
+                <w:sz w:val="16"/>
+                <w:szCs w:val="16"/>
               </w:rPr>
             </w:pPr>
           </w:p>
@@ -939,17 +939,17 @@
                 <w:rFonts w:ascii="Arial" w:hAnsi="Arial" w:cs="Arial"/>
                 <w:b/>
                 <w:bCs/>
-                <w:sz w:val="18"/>
-                <w:szCs w:val="18"/>
-              </w:rPr>
-            </w:pPr>
-            <w:r>
-              <w:rPr>
-                <w:rFonts w:ascii="Arial" w:hAnsi="Arial" w:cs="Arial"/>
-                <w:b/>
-                <w:bCs/>
-                <w:sz w:val="18"/>
-                <w:szCs w:val="18"/>
+                <w:sz w:val="16"/>
+                <w:szCs w:val="16"/>
+              </w:rPr>
+            </w:pPr>
+            <w:r>
+              <w:rPr>
+                <w:rFonts w:ascii="Arial" w:hAnsi="Arial" w:cs="Arial"/>
+                <w:b/>
+                <w:bCs/>
+                <w:sz w:val="16"/>
+                <w:szCs w:val="16"/>
               </w:rPr>
               <w:t xml:space="preserve">Data Emissão </w:t>
             </w:r>
@@ -959,8 +959,8 @@
                 <w:rFonts w:ascii="Arial" w:hAnsi="Arial" w:cs="Arial"/>
                 <w:b/>
                 <w:bCs/>
-                <w:sz w:val="18"/>
-                <w:szCs w:val="18"/>
+                <w:sz w:val="16"/>
+                <w:szCs w:val="16"/>
               </w:rPr>
               <w:t>Nf</w:t>
             </w:r>
@@ -970,8 +970,8 @@
                 <w:rFonts w:ascii="Arial" w:hAnsi="Arial" w:cs="Arial"/>
                 <w:b/>
                 <w:bCs/>
-                <w:sz w:val="18"/>
-                <w:szCs w:val="18"/>
+                <w:sz w:val="16"/>
+                <w:szCs w:val="16"/>
               </w:rPr>
               <w:t>:</w:t>
             </w:r>
@@ -992,8 +992,8 @@
                 <w:rFonts w:ascii="Arial" w:hAnsi="Arial" w:cs="Arial"/>
                 <w:b/>
                 <w:bCs/>
-                <w:sz w:val="18"/>
-                <w:szCs w:val="18"/>
+                <w:sz w:val="16"/>
+                <w:szCs w:val="16"/>
               </w:rPr>
             </w:pPr>
           </w:p>
@@ -1013,17 +1013,17 @@
                 <w:rFonts w:ascii="Arial" w:hAnsi="Arial" w:cs="Arial"/>
                 <w:b/>
                 <w:bCs/>
-                <w:sz w:val="18"/>
-                <w:szCs w:val="18"/>
-              </w:rPr>
-            </w:pPr>
-            <w:r>
-              <w:rPr>
-                <w:rFonts w:ascii="Arial" w:hAnsi="Arial" w:cs="Arial"/>
-                <w:b/>
-                <w:bCs/>
-                <w:sz w:val="18"/>
-                <w:szCs w:val="18"/>
+                <w:sz w:val="16"/>
+                <w:szCs w:val="16"/>
+              </w:rPr>
+            </w:pPr>
+            <w:r>
+              <w:rPr>
+                <w:rFonts w:ascii="Arial" w:hAnsi="Arial" w:cs="Arial"/>
+                <w:b/>
+                <w:bCs/>
+                <w:sz w:val="16"/>
+                <w:szCs w:val="16"/>
               </w:rPr>
               <w:t>Nota Fiscal Nº:</w:t>
             </w:r>
@@ -1044,8 +1044,8 @@
                 <w:rFonts w:ascii="Arial" w:hAnsi="Arial" w:cs="Arial"/>
                 <w:b/>
                 <w:bCs/>
-                <w:sz w:val="18"/>
-                <w:szCs w:val="18"/>
+                <w:sz w:val="16"/>
+                <w:szCs w:val="16"/>
               </w:rPr>
             </w:pPr>
           </w:p>
@@ -1070,17 +1070,17 @@
                 <w:rFonts w:ascii="Arial" w:hAnsi="Arial" w:cs="Arial"/>
                 <w:b/>
                 <w:bCs/>
-                <w:sz w:val="18"/>
-                <w:szCs w:val="18"/>
-              </w:rPr>
-            </w:pPr>
-            <w:r>
-              <w:rPr>
-                <w:rFonts w:ascii="Arial" w:hAnsi="Arial" w:cs="Arial"/>
-                <w:b/>
-                <w:bCs/>
-                <w:sz w:val="18"/>
-                <w:szCs w:val="18"/>
+                <w:sz w:val="16"/>
+                <w:szCs w:val="16"/>
+              </w:rPr>
+            </w:pPr>
+            <w:r>
+              <w:rPr>
+                <w:rFonts w:ascii="Arial" w:hAnsi="Arial" w:cs="Arial"/>
+                <w:b/>
+                <w:bCs/>
+                <w:sz w:val="16"/>
+                <w:szCs w:val="16"/>
               </w:rPr>
               <w:t>Quantidade:</w:t>
             </w:r>
@@ -1101,8 +1101,8 @@
                 <w:rFonts w:ascii="Arial" w:hAnsi="Arial" w:cs="Arial"/>
                 <w:b/>
                 <w:bCs/>
-                <w:sz w:val="18"/>
-                <w:szCs w:val="18"/>
+                <w:sz w:val="16"/>
+                <w:szCs w:val="16"/>
               </w:rPr>
             </w:pPr>
           </w:p>
@@ -1122,17 +1122,17 @@
                 <w:rFonts w:ascii="Arial" w:hAnsi="Arial" w:cs="Arial"/>
                 <w:b/>
                 <w:bCs/>
-                <w:sz w:val="18"/>
-                <w:szCs w:val="18"/>
-              </w:rPr>
-            </w:pPr>
-            <w:r>
-              <w:rPr>
-                <w:rFonts w:ascii="Arial" w:hAnsi="Arial" w:cs="Arial"/>
-                <w:b/>
-                <w:bCs/>
-                <w:sz w:val="18"/>
-                <w:szCs w:val="18"/>
+                <w:sz w:val="16"/>
+                <w:szCs w:val="16"/>
+              </w:rPr>
+            </w:pPr>
+            <w:r>
+              <w:rPr>
+                <w:rFonts w:ascii="Arial" w:hAnsi="Arial" w:cs="Arial"/>
+                <w:b/>
+                <w:bCs/>
+                <w:sz w:val="16"/>
+                <w:szCs w:val="16"/>
               </w:rPr>
               <w:t>Pedido Nº:</w:t>
             </w:r>
@@ -1153,8 +1153,8 @@
                 <w:rFonts w:ascii="Arial" w:hAnsi="Arial" w:cs="Arial"/>
                 <w:b/>
                 <w:bCs/>
-                <w:sz w:val="18"/>
-                <w:szCs w:val="18"/>
+                <w:sz w:val="16"/>
+                <w:szCs w:val="16"/>
               </w:rPr>
             </w:pPr>
           </w:p>
@@ -1179,17 +1179,17 @@
                 <w:rFonts w:ascii="Arial" w:hAnsi="Arial" w:cs="Arial"/>
                 <w:b/>
                 <w:bCs/>
-                <w:sz w:val="18"/>
-                <w:szCs w:val="18"/>
-              </w:rPr>
-            </w:pPr>
-            <w:r>
-              <w:rPr>
-                <w:rFonts w:ascii="Arial" w:hAnsi="Arial" w:cs="Arial"/>
-                <w:b/>
-                <w:bCs/>
-                <w:sz w:val="18"/>
-                <w:szCs w:val="18"/>
+                <w:sz w:val="16"/>
+                <w:szCs w:val="16"/>
+              </w:rPr>
+            </w:pPr>
+            <w:r>
+              <w:rPr>
+                <w:rFonts w:ascii="Arial" w:hAnsi="Arial" w:cs="Arial"/>
+                <w:b/>
+                <w:bCs/>
+                <w:sz w:val="16"/>
+                <w:szCs w:val="16"/>
               </w:rPr>
               <w:t>1 - RECLAMAÇÃO / SUGESTÃO</w:t>
             </w:r>
@@ -1215,17 +1215,17 @@
                 <w:rFonts w:ascii="Arial" w:hAnsi="Arial" w:cs="Arial"/>
                 <w:b/>
                 <w:bCs/>
-                <w:sz w:val="18"/>
-                <w:szCs w:val="18"/>
-              </w:rPr>
-            </w:pPr>
-            <w:r>
-              <w:rPr>
-                <w:rFonts w:ascii="Arial" w:hAnsi="Arial" w:cs="Arial"/>
-                <w:b/>
-                <w:bCs/>
-                <w:sz w:val="18"/>
-                <w:szCs w:val="18"/>
+                <w:sz w:val="16"/>
+                <w:szCs w:val="16"/>
+              </w:rPr>
+            </w:pPr>
+            <w:r>
+              <w:rPr>
+                <w:rFonts w:ascii="Arial" w:hAnsi="Arial" w:cs="Arial"/>
+                <w:b/>
+                <w:bCs/>
+                <w:sz w:val="16"/>
+                <w:szCs w:val="16"/>
               </w:rPr>
               <w:t>Tipo de reclamação</w:t>
             </w:r>
@@ -1246,8 +1246,8 @@
                 <w:rFonts w:ascii="Arial" w:hAnsi="Arial" w:cs="Arial"/>
                 <w:b/>
                 <w:bCs/>
-                <w:sz w:val="18"/>
-                <w:szCs w:val="18"/>
+                <w:sz w:val="16"/>
+                <w:szCs w:val="16"/>
               </w:rPr>
             </w:pPr>
           </w:p>
@@ -1272,17 +1272,17 @@
                 <w:rFonts w:ascii="Arial" w:hAnsi="Arial" w:cs="Arial"/>
                 <w:b/>
                 <w:bCs/>
-                <w:sz w:val="18"/>
-                <w:szCs w:val="18"/>
-              </w:rPr>
-            </w:pPr>
-            <w:r>
-              <w:rPr>
-                <w:rFonts w:ascii="Arial" w:hAnsi="Arial" w:cs="Arial"/>
-                <w:b/>
-                <w:bCs/>
-                <w:sz w:val="18"/>
-                <w:szCs w:val="18"/>
+                <w:sz w:val="16"/>
+                <w:szCs w:val="16"/>
+              </w:rPr>
+            </w:pPr>
+            <w:r>
+              <w:rPr>
+                <w:rFonts w:ascii="Arial" w:hAnsi="Arial" w:cs="Arial"/>
+                <w:b/>
+                <w:bCs/>
+                <w:sz w:val="16"/>
+                <w:szCs w:val="16"/>
               </w:rPr>
               <w:t>DESCRIÇÃO DA RECLAMAÇÃO:</w:t>
             </w:r>
@@ -1308,8 +1308,8 @@
                 <w:rFonts w:ascii="Arial" w:hAnsi="Arial" w:cs="Arial"/>
                 <w:b/>
                 <w:bCs/>
-                <w:sz w:val="18"/>
-                <w:szCs w:val="18"/>
+                <w:sz w:val="16"/>
+                <w:szCs w:val="16"/>
               </w:rPr>
             </w:pPr>
           </w:p>
@@ -1334,17 +1334,17 @@
                 <w:rFonts w:ascii="Arial" w:hAnsi="Arial" w:cs="Arial"/>
                 <w:b/>
                 <w:bCs/>
-                <w:sz w:val="18"/>
-                <w:szCs w:val="18"/>
-              </w:rPr>
-            </w:pPr>
-            <w:r>
-              <w:rPr>
-                <w:rFonts w:ascii="Arial" w:hAnsi="Arial" w:cs="Arial"/>
-                <w:b/>
-                <w:bCs/>
-                <w:sz w:val="18"/>
-                <w:szCs w:val="18"/>
+                <w:sz w:val="16"/>
+                <w:szCs w:val="16"/>
+              </w:rPr>
+            </w:pPr>
+            <w:r>
+              <w:rPr>
+                <w:rFonts w:ascii="Arial" w:hAnsi="Arial" w:cs="Arial"/>
+                <w:b/>
+                <w:bCs/>
+                <w:sz w:val="16"/>
+                <w:szCs w:val="16"/>
               </w:rPr>
               <w:t>2 – ANÁLISE DA RECLAMAÇÃO</w:t>
             </w:r>
@@ -1370,17 +1370,17 @@
                 <w:rFonts w:ascii="Arial" w:hAnsi="Arial" w:cs="Arial"/>
                 <w:b/>
                 <w:bCs/>
-                <w:sz w:val="18"/>
-                <w:szCs w:val="18"/>
-              </w:rPr>
-            </w:pPr>
-            <w:r>
-              <w:rPr>
-                <w:rFonts w:ascii="Arial" w:hAnsi="Arial" w:cs="Arial"/>
-                <w:b/>
-                <w:bCs/>
-                <w:sz w:val="18"/>
-                <w:szCs w:val="18"/>
+                <w:sz w:val="16"/>
+                <w:szCs w:val="16"/>
+              </w:rPr>
+            </w:pPr>
+            <w:r>
+              <w:rPr>
+                <w:rFonts w:ascii="Arial" w:hAnsi="Arial" w:cs="Arial"/>
+                <w:b/>
+                <w:bCs/>
+                <w:sz w:val="16"/>
+                <w:szCs w:val="16"/>
               </w:rPr>
               <w:t>Reclamação Aceita?</w:t>
             </w:r>
@@ -1401,8 +1401,8 @@
                 <w:rFonts w:ascii="Arial" w:hAnsi="Arial" w:cs="Arial"/>
                 <w:b/>
                 <w:bCs/>
-                <w:sz w:val="18"/>
-                <w:szCs w:val="18"/>
+                <w:sz w:val="16"/>
+                <w:szCs w:val="16"/>
               </w:rPr>
             </w:pPr>
           </w:p>
@@ -1422,17 +1422,17 @@
                 <w:rFonts w:ascii="Arial" w:hAnsi="Arial" w:cs="Arial"/>
                 <w:b/>
                 <w:bCs/>
-                <w:sz w:val="18"/>
-                <w:szCs w:val="18"/>
-              </w:rPr>
-            </w:pPr>
-            <w:r>
-              <w:rPr>
-                <w:rFonts w:ascii="Arial" w:hAnsi="Arial" w:cs="Arial"/>
-                <w:b/>
-                <w:bCs/>
-                <w:sz w:val="18"/>
-                <w:szCs w:val="18"/>
+                <w:sz w:val="16"/>
+                <w:szCs w:val="16"/>
+              </w:rPr>
+            </w:pPr>
+            <w:r>
+              <w:rPr>
+                <w:rFonts w:ascii="Arial" w:hAnsi="Arial" w:cs="Arial"/>
+                <w:b/>
+                <w:bCs/>
+                <w:sz w:val="16"/>
+                <w:szCs w:val="16"/>
               </w:rPr>
               <w:t>Dentro da garantia?</w:t>
             </w:r>
@@ -1453,8 +1453,8 @@
                 <w:rFonts w:ascii="Arial" w:hAnsi="Arial" w:cs="Arial"/>
                 <w:b/>
                 <w:bCs/>
-                <w:sz w:val="18"/>
-                <w:szCs w:val="18"/>
+                <w:sz w:val="16"/>
+                <w:szCs w:val="16"/>
               </w:rPr>
             </w:pPr>
           </w:p>
@@ -1474,17 +1474,17 @@
                 <w:rFonts w:ascii="Arial" w:hAnsi="Arial" w:cs="Arial"/>
                 <w:b/>
                 <w:bCs/>
-                <w:sz w:val="18"/>
-                <w:szCs w:val="18"/>
-              </w:rPr>
-            </w:pPr>
-            <w:r>
-              <w:rPr>
-                <w:rFonts w:ascii="Arial" w:hAnsi="Arial" w:cs="Arial"/>
-                <w:b/>
-                <w:bCs/>
-                <w:sz w:val="18"/>
-                <w:szCs w:val="18"/>
+                <w:sz w:val="16"/>
+                <w:szCs w:val="16"/>
+              </w:rPr>
+            </w:pPr>
+            <w:r>
+              <w:rPr>
+                <w:rFonts w:ascii="Arial" w:hAnsi="Arial" w:cs="Arial"/>
+                <w:b/>
+                <w:bCs/>
+                <w:sz w:val="16"/>
+                <w:szCs w:val="16"/>
               </w:rPr>
               <w:t>Abrir Ordem De Serviço?</w:t>
             </w:r>
@@ -1505,8 +1505,8 @@
                 <w:rFonts w:ascii="Arial" w:hAnsi="Arial" w:cs="Arial"/>
                 <w:b/>
                 <w:bCs/>
-                <w:sz w:val="18"/>
-                <w:szCs w:val="18"/>
+                <w:sz w:val="16"/>
+                <w:szCs w:val="16"/>
               </w:rPr>
             </w:pPr>
           </w:p>
@@ -1531,17 +1531,17 @@
                 <w:rFonts w:ascii="Arial" w:hAnsi="Arial" w:cs="Arial"/>
                 <w:b/>
                 <w:bCs/>
-                <w:sz w:val="18"/>
-                <w:szCs w:val="18"/>
-              </w:rPr>
-            </w:pPr>
-            <w:r>
-              <w:rPr>
-                <w:rFonts w:ascii="Arial" w:hAnsi="Arial" w:cs="Arial"/>
-                <w:b/>
-                <w:bCs/>
-                <w:sz w:val="18"/>
-                <w:szCs w:val="18"/>
+                <w:sz w:val="16"/>
+                <w:szCs w:val="16"/>
+              </w:rPr>
+            </w:pPr>
+            <w:r>
+              <w:rPr>
+                <w:rFonts w:ascii="Arial" w:hAnsi="Arial" w:cs="Arial"/>
+                <w:b/>
+                <w:bCs/>
+                <w:sz w:val="16"/>
+                <w:szCs w:val="16"/>
               </w:rPr>
               <w:t>Comentário</w:t>
             </w:r>
@@ -1562,8 +1562,8 @@
                 <w:rFonts w:ascii="Arial" w:hAnsi="Arial" w:cs="Arial"/>
                 <w:b/>
                 <w:bCs/>
-                <w:sz w:val="18"/>
-                <w:szCs w:val="18"/>
+                <w:sz w:val="16"/>
+                <w:szCs w:val="16"/>
               </w:rPr>
             </w:pPr>
           </w:p>
@@ -1588,8 +1588,8 @@
                 <w:rFonts w:ascii="Arial" w:hAnsi="Arial" w:cs="Arial"/>
                 <w:b/>
                 <w:bCs/>
-                <w:sz w:val="18"/>
-                <w:szCs w:val="18"/>
+                <w:sz w:val="16"/>
+                <w:szCs w:val="16"/>
               </w:rPr>
             </w:pPr>
             <w:r>
@@ -1598,8 +1598,8 @@
                 <w:b/>
                 <w:bCs/>
                 <w:i/>
-                <w:sz w:val="18"/>
-                <w:szCs w:val="18"/>
+                <w:sz w:val="16"/>
+                <w:szCs w:val="16"/>
               </w:rPr>
               <w:t>Responsável pela análise</w:t>
             </w:r>
@@ -1620,8 +1620,8 @@
                 <w:rFonts w:ascii="Arial" w:hAnsi="Arial" w:cs="Arial"/>
                 <w:b/>
                 <w:bCs/>
-                <w:sz w:val="18"/>
-                <w:szCs w:val="18"/>
+                <w:sz w:val="16"/>
+                <w:szCs w:val="16"/>
               </w:rPr>
             </w:pPr>
           </w:p>
@@ -1646,17 +1646,17 @@
                 <w:rFonts w:ascii="Arial" w:hAnsi="Arial" w:cs="Arial"/>
                 <w:b/>
                 <w:bCs/>
-                <w:sz w:val="18"/>
-                <w:szCs w:val="18"/>
-              </w:rPr>
-            </w:pPr>
-            <w:r>
-              <w:rPr>
-                <w:rFonts w:ascii="Arial" w:hAnsi="Arial" w:cs="Arial"/>
-                <w:b/>
-                <w:bCs/>
-                <w:sz w:val="18"/>
-                <w:szCs w:val="18"/>
+                <w:sz w:val="16"/>
+                <w:szCs w:val="16"/>
+              </w:rPr>
+            </w:pPr>
+            <w:r>
+              <w:rPr>
+                <w:rFonts w:ascii="Arial" w:hAnsi="Arial" w:cs="Arial"/>
+                <w:b/>
+                <w:bCs/>
+                <w:sz w:val="16"/>
+                <w:szCs w:val="16"/>
               </w:rPr>
               <w:t>4 – CONFIRMAÇÃO DA REALIZAÇÃO DO SERVIÇO</w:t>
             </w:r>
@@ -1682,8 +1682,8 @@
                 <w:rFonts w:ascii="Arial" w:hAnsi="Arial" w:cs="Arial"/>
                 <w:b/>
                 <w:bCs/>
-                <w:sz w:val="18"/>
-                <w:szCs w:val="18"/>
+                <w:sz w:val="16"/>
+                <w:szCs w:val="16"/>
               </w:rPr>
             </w:pPr>
           </w:p>
@@ -1703,8 +1703,8 @@
                 <w:rFonts w:ascii="Arial" w:hAnsi="Arial" w:cs="Arial"/>
                 <w:b/>
                 <w:bCs/>
-                <w:sz w:val="18"/>
-                <w:szCs w:val="18"/>
+                <w:sz w:val="16"/>
+                <w:szCs w:val="16"/>
               </w:rPr>
             </w:pPr>
           </w:p>
@@ -1729,8 +1729,8 @@
                 <w:rFonts w:ascii="Arial" w:hAnsi="Arial" w:cs="Arial"/>
                 <w:b/>
                 <w:bCs/>
-                <w:sz w:val="18"/>
-                <w:szCs w:val="18"/>
+                <w:sz w:val="16"/>
+                <w:szCs w:val="16"/>
               </w:rPr>
             </w:pPr>
             <w:r>
@@ -1739,8 +1739,8 @@
                 <w:b/>
                 <w:bCs/>
                 <w:i/>
-                <w:sz w:val="18"/>
-                <w:szCs w:val="18"/>
+                <w:sz w:val="16"/>
+                <w:szCs w:val="16"/>
               </w:rPr>
               <w:t>Administração</w:t>
             </w:r>
@@ -1761,8 +1761,8 @@
                 <w:rFonts w:ascii="Arial" w:hAnsi="Arial" w:cs="Arial"/>
                 <w:b/>
                 <w:bCs/>
-                <w:sz w:val="18"/>
-                <w:szCs w:val="18"/>
+                <w:sz w:val="16"/>
+                <w:szCs w:val="16"/>
               </w:rPr>
             </w:pPr>
             <w:r>
@@ -1771,8 +1771,8 @@
                 <w:b/>
                 <w:bCs/>
                 <w:i/>
-                <w:sz w:val="18"/>
-                <w:szCs w:val="18"/>
+                <w:sz w:val="16"/>
+                <w:szCs w:val="16"/>
               </w:rPr>
               <w:t>Diretoria</w:t>
             </w:r>
@@ -1780,13 +1780,6 @@
         </w:tc>
       </w:tr>
     </w:tbl>
-    <w:p>
-      <w:pPr>
-        <w:rPr>
-          <w:b/>
-        </w:rPr>
-      </w:pPr>
-    </w:p>
     <w:sectPr>
       <w:headerReference w:type="even" r:id="rId7"/>
       <w:headerReference w:type="default" r:id="rId8"/>
@@ -2653,8 +2646,8 @@
     <w:name w:val="Normal"/>
     <w:qFormat/>
     <w:rPr>
-      <w:sz w:val="24"/>
-      <w:szCs w:val="24"/>
+      <w:sz w:val="16"/>
+      <w:szCs w:val="16"/>
     </w:rPr>
   </w:style>
   <w:style w:type="character" w:default="1" w:styleId="Fontepargpadro">
@@ -2727,8 +2720,8 @@
     <w:uiPriority w:val="99"/>
     <w:rsid w:val="005C784D"/>
     <w:rPr>
-      <w:sz w:val="24"/>
-      <w:szCs w:val="24"/>
+      <w:sz w:val="16"/>
+      <w:szCs w:val="16"/>
     </w:rPr>
   </w:style>
   <w:style w:type="paragraph" w:styleId="Rodap">
@@ -2751,8 +2744,8 @@
     <w:uiPriority w:val="99"/>
     <w:rsid w:val="005C784D"/>
     <w:rPr>
-      <w:sz w:val="24"/>
-      <w:szCs w:val="24"/>
+      <w:sz w:val="16"/>
+      <w:szCs w:val="16"/>
     </w:rPr>
   </w:style>
   <w:style w:type="paragraph" w:styleId="Textodebalo">
@@ -2801,8 +2794,8 @@
     <w:unhideWhenUsed/>
     <w:rsid w:val="00C67204"/>
     <w:rPr>
-      <w:sz w:val="20"/>
-      <w:szCs w:val="20"/>
+      <w:sz w:val="16"/>
+      <w:szCs w:val="16"/>
     </w:rPr>
   </w:style>
   <w:style w:type="character" w:customStyle="1" w:styleId="TextodecomentrioChar">

</xml_diff>